<commit_message>
wip: I finished my test cases (14 functional requirements).
</commit_message>
<xml_diff>
--- a/02-Documentation/03-test-cases/test-cases.docx
+++ b/02-Documentation/03-test-cases/test-cases.docx
@@ -1967,38 +1967,2010 @@
               </w:rPr>
               <w:t>Cancela la asignación al estudiante y le notifica que ya la tiene asociada a su horario.</w:t>
             </w:r>
+          </w:p>
+        </w:tc>
+        <w:tc>
+          <w:tcPr>
+            <w:tcW w:w="2077" w:type="dxa"/>
+          </w:tcPr>
+          <w:p>
+            <w:pPr>
+              <w:jc w:val="center"/>
+              <w:rPr>
+                <w:rFonts w:ascii="Arial" w:hAnsi="Arial" w:cs="Arial"/>
+                <w:lang w:val="es-ES"/>
+              </w:rPr>
+            </w:pPr>
+          </w:p>
+        </w:tc>
+      </w:tr>
+      <w:tr>
+        <w:tc>
+          <w:tcPr>
+            <w:tcW w:w="1617" w:type="dxa"/>
+          </w:tcPr>
+          <w:p>
+            <w:pPr>
+              <w:jc w:val="center"/>
+              <w:rPr>
+                <w:rFonts w:ascii="Arial" w:hAnsi="Arial" w:cs="Arial"/>
+                <w:lang w:val="es-ES"/>
+              </w:rPr>
+            </w:pPr>
+            <w:r>
+              <w:rPr>
+                <w:rFonts w:ascii="Arial" w:hAnsi="Arial" w:cs="Arial"/>
+                <w:lang w:val="es-ES"/>
+              </w:rPr>
+              <w:t>CP-16</w:t>
+            </w:r>
+          </w:p>
+        </w:tc>
+        <w:tc>
+          <w:tcPr>
+            <w:tcW w:w="2074" w:type="dxa"/>
+          </w:tcPr>
+          <w:p>
+            <w:pPr>
+              <w:jc w:val="center"/>
+              <w:rPr>
+                <w:rFonts w:ascii="Arial" w:hAnsi="Arial" w:cs="Arial"/>
+                <w:lang w:val="es-ES"/>
+              </w:rPr>
+            </w:pPr>
+            <w:r>
+              <w:rPr>
+                <w:rFonts w:ascii="Arial" w:hAnsi="Arial" w:cs="Arial"/>
+                <w:lang w:val="es-ES"/>
+              </w:rPr>
+              <w:t>RF-07</w:t>
+            </w:r>
+          </w:p>
+        </w:tc>
+        <w:tc>
+          <w:tcPr>
+            <w:tcW w:w="1651" w:type="dxa"/>
+          </w:tcPr>
+          <w:p>
+            <w:pPr>
+              <w:jc w:val="center"/>
+              <w:rPr>
+                <w:rFonts w:ascii="Arial" w:hAnsi="Arial" w:cs="Arial"/>
+                <w:lang w:val="es-ES"/>
+              </w:rPr>
+            </w:pPr>
+            <w:r>
+              <w:rPr>
+                <w:rFonts w:ascii="Arial" w:hAnsi="Arial" w:cs="Arial"/>
+                <w:lang w:val="es-ES"/>
+              </w:rPr>
+              <w:t>Intento de cancela una asignatura no asignada.</w:t>
+            </w:r>
+          </w:p>
+        </w:tc>
+        <w:tc>
+          <w:tcPr>
+            <w:tcW w:w="2924" w:type="dxa"/>
+          </w:tcPr>
+          <w:p>
+            <w:pPr>
+              <w:jc w:val="center"/>
+              <w:rPr>
+                <w:rFonts w:ascii="Arial" w:hAnsi="Arial" w:cs="Arial"/>
+                <w:lang w:val="es-ES"/>
+              </w:rPr>
+            </w:pPr>
+            <w:r>
+              <w:rPr>
+                <w:rFonts w:ascii="Arial" w:hAnsi="Arial" w:cs="Arial"/>
+                <w:lang w:val="es-ES"/>
+              </w:rPr>
+              <w:t>El sistema rechaza la cancelación de la asignatura y muestra un mensaje sobre el error.</w:t>
+            </w:r>
+          </w:p>
+        </w:tc>
+        <w:tc>
+          <w:tcPr>
+            <w:tcW w:w="2077" w:type="dxa"/>
+          </w:tcPr>
+          <w:p>
+            <w:pPr>
+              <w:jc w:val="center"/>
+              <w:rPr>
+                <w:rFonts w:ascii="Arial" w:hAnsi="Arial" w:cs="Arial"/>
+                <w:lang w:val="es-ES"/>
+              </w:rPr>
+            </w:pPr>
+          </w:p>
+        </w:tc>
+      </w:tr>
+      <w:tr>
+        <w:tc>
+          <w:tcPr>
+            <w:tcW w:w="1617" w:type="dxa"/>
+          </w:tcPr>
+          <w:p>
+            <w:pPr>
+              <w:jc w:val="center"/>
+              <w:rPr>
+                <w:rFonts w:ascii="Arial" w:hAnsi="Arial" w:cs="Arial"/>
+                <w:lang w:val="es-ES"/>
+              </w:rPr>
+            </w:pPr>
+            <w:r>
+              <w:rPr>
+                <w:rFonts w:ascii="Arial" w:hAnsi="Arial" w:cs="Arial"/>
+                <w:lang w:val="es-ES"/>
+              </w:rPr>
+              <w:t>CP-17</w:t>
+            </w:r>
+          </w:p>
+        </w:tc>
+        <w:tc>
+          <w:tcPr>
+            <w:tcW w:w="2074" w:type="dxa"/>
+          </w:tcPr>
+          <w:p>
+            <w:pPr>
+              <w:jc w:val="center"/>
+              <w:rPr>
+                <w:rFonts w:ascii="Arial" w:hAnsi="Arial" w:cs="Arial"/>
+                <w:lang w:val="es-ES"/>
+              </w:rPr>
+            </w:pPr>
+          </w:p>
+          <w:p>
+            <w:pPr>
+              <w:jc w:val="center"/>
+              <w:rPr>
+                <w:rFonts w:ascii="Arial" w:hAnsi="Arial" w:cs="Arial"/>
+                <w:lang w:val="es-ES"/>
+              </w:rPr>
+            </w:pPr>
+          </w:p>
+          <w:p>
+            <w:pPr>
+              <w:jc w:val="center"/>
+              <w:rPr>
+                <w:rFonts w:ascii="Arial" w:hAnsi="Arial" w:cs="Arial"/>
+                <w:lang w:val="es-ES"/>
+              </w:rPr>
+            </w:pPr>
+            <w:r>
+              <w:rPr>
+                <w:rFonts w:ascii="Arial" w:hAnsi="Arial" w:cs="Arial"/>
+                <w:lang w:val="es-ES"/>
+              </w:rPr>
+              <w:t>RF-08</w:t>
+            </w:r>
+          </w:p>
+        </w:tc>
+        <w:tc>
+          <w:tcPr>
+            <w:tcW w:w="1651" w:type="dxa"/>
+          </w:tcPr>
+          <w:p>
+            <w:pPr>
+              <w:jc w:val="center"/>
+              <w:rPr>
+                <w:rFonts w:ascii="Arial" w:hAnsi="Arial" w:cs="Arial"/>
+                <w:lang w:val="es-ES"/>
+              </w:rPr>
+            </w:pPr>
+            <w:r>
+              <w:rPr>
+                <w:rFonts w:ascii="Arial" w:hAnsi="Arial" w:cs="Arial"/>
+                <w:lang w:val="es-ES"/>
+              </w:rPr>
+              <w:t>Sesión activa y el estudiante tiene matrícula financiera vigente.</w:t>
+            </w:r>
+          </w:p>
+        </w:tc>
+        <w:tc>
+          <w:tcPr>
+            <w:tcW w:w="2924" w:type="dxa"/>
+          </w:tcPr>
+          <w:p>
+            <w:pPr>
+              <w:jc w:val="center"/>
+              <w:rPr>
+                <w:rFonts w:ascii="Arial" w:hAnsi="Arial" w:cs="Arial"/>
+                <w:lang w:val="es-ES"/>
+              </w:rPr>
+            </w:pPr>
+          </w:p>
+          <w:p>
+            <w:pPr>
+              <w:jc w:val="center"/>
+              <w:rPr>
+                <w:rFonts w:ascii="Arial" w:hAnsi="Arial" w:cs="Arial"/>
+                <w:lang w:val="es-ES"/>
+              </w:rPr>
+            </w:pPr>
+          </w:p>
+          <w:p>
+            <w:pPr>
+              <w:jc w:val="center"/>
+              <w:rPr>
+                <w:rFonts w:ascii="Arial" w:hAnsi="Arial" w:cs="Arial"/>
+                <w:lang w:val="es-ES"/>
+              </w:rPr>
+            </w:pPr>
+            <w:r>
+              <w:rPr>
+                <w:rFonts w:ascii="Arial" w:hAnsi="Arial" w:cs="Arial"/>
+                <w:lang w:val="es-ES"/>
+              </w:rPr>
+              <w:t>El sistema genera la solicitud de paz y salvo.</w:t>
+            </w:r>
+          </w:p>
+        </w:tc>
+        <w:tc>
+          <w:tcPr>
+            <w:tcW w:w="2077" w:type="dxa"/>
+          </w:tcPr>
+          <w:p>
+            <w:pPr>
+              <w:jc w:val="center"/>
+              <w:rPr>
+                <w:rFonts w:ascii="Arial" w:hAnsi="Arial" w:cs="Arial"/>
+                <w:lang w:val="es-ES"/>
+              </w:rPr>
+            </w:pPr>
+          </w:p>
+        </w:tc>
+      </w:tr>
+      <w:tr>
+        <w:tc>
+          <w:tcPr>
+            <w:tcW w:w="1617" w:type="dxa"/>
+          </w:tcPr>
+          <w:p>
+            <w:pPr>
+              <w:jc w:val="center"/>
+              <w:rPr>
+                <w:rFonts w:ascii="Arial" w:hAnsi="Arial" w:cs="Arial"/>
+              </w:rPr>
+            </w:pPr>
+          </w:p>
+          <w:p>
+            <w:pPr>
+              <w:jc w:val="center"/>
+              <w:rPr>
+                <w:rFonts w:ascii="Arial" w:hAnsi="Arial" w:cs="Arial"/>
+              </w:rPr>
+            </w:pPr>
+          </w:p>
+          <w:p>
+            <w:pPr>
+              <w:jc w:val="center"/>
+              <w:rPr>
+                <w:rFonts w:ascii="Arial" w:hAnsi="Arial" w:cs="Arial"/>
+              </w:rPr>
+            </w:pPr>
+          </w:p>
+          <w:p>
+            <w:pPr>
+              <w:jc w:val="center"/>
+              <w:rPr>
+                <w:rFonts w:ascii="Arial" w:hAnsi="Arial" w:cs="Arial"/>
+              </w:rPr>
+            </w:pPr>
+            <w:r>
+              <w:rPr>
+                <w:rFonts w:ascii="Arial" w:hAnsi="Arial" w:cs="Arial"/>
+              </w:rPr>
+              <w:t>CP-18</w:t>
+            </w:r>
+          </w:p>
+        </w:tc>
+        <w:tc>
+          <w:tcPr>
+            <w:tcW w:w="2074" w:type="dxa"/>
+          </w:tcPr>
+          <w:p>
+            <w:pPr>
+              <w:jc w:val="center"/>
+              <w:rPr>
+                <w:rFonts w:ascii="Arial" w:hAnsi="Arial" w:cs="Arial"/>
+                <w:lang w:val="es-ES"/>
+              </w:rPr>
+            </w:pPr>
+          </w:p>
+          <w:p>
+            <w:pPr>
+              <w:jc w:val="center"/>
+              <w:rPr>
+                <w:rFonts w:ascii="Arial" w:hAnsi="Arial" w:cs="Arial"/>
+                <w:lang w:val="es-ES"/>
+              </w:rPr>
+            </w:pPr>
+          </w:p>
+          <w:p>
+            <w:pPr>
+              <w:jc w:val="center"/>
+              <w:rPr>
+                <w:rFonts w:ascii="Arial" w:hAnsi="Arial" w:cs="Arial"/>
+                <w:lang w:val="es-ES"/>
+              </w:rPr>
+            </w:pPr>
+          </w:p>
+          <w:p>
+            <w:pPr>
+              <w:jc w:val="center"/>
+              <w:rPr>
+                <w:rFonts w:ascii="Arial" w:hAnsi="Arial" w:cs="Arial"/>
+                <w:lang w:val="es-ES"/>
+              </w:rPr>
+            </w:pPr>
+            <w:r>
+              <w:rPr>
+                <w:rFonts w:ascii="Arial" w:hAnsi="Arial" w:cs="Arial"/>
+                <w:lang w:val="es-ES"/>
+              </w:rPr>
+              <w:t>RF-08</w:t>
+            </w:r>
+          </w:p>
+        </w:tc>
+        <w:tc>
+          <w:tcPr>
+            <w:tcW w:w="1651" w:type="dxa"/>
+          </w:tcPr>
+          <w:p>
+            <w:pPr>
+              <w:jc w:val="center"/>
+              <w:rPr>
+                <w:rFonts w:ascii="Arial" w:hAnsi="Arial" w:cs="Arial"/>
+                <w:lang w:val="es-ES"/>
+              </w:rPr>
+            </w:pPr>
+            <w:r>
+              <w:rPr>
+                <w:rFonts w:ascii="Arial" w:hAnsi="Arial" w:cs="Arial"/>
+                <w:lang w:val="es-ES"/>
+              </w:rPr>
+              <w:t>Sesión activa pero el estudiante no tiene matrícula financiera vigente.</w:t>
+            </w:r>
+          </w:p>
+        </w:tc>
+        <w:tc>
+          <w:tcPr>
+            <w:tcW w:w="2924" w:type="dxa"/>
+          </w:tcPr>
+          <w:p>
+            <w:pPr>
+              <w:jc w:val="center"/>
+              <w:rPr>
+                <w:rFonts w:ascii="Arial" w:hAnsi="Arial" w:cs="Arial"/>
+                <w:lang w:val="es-ES"/>
+              </w:rPr>
+            </w:pPr>
+          </w:p>
+          <w:p>
+            <w:pPr>
+              <w:jc w:val="center"/>
+              <w:rPr>
+                <w:rFonts w:ascii="Arial" w:hAnsi="Arial" w:cs="Arial"/>
+                <w:lang w:val="es-ES"/>
+              </w:rPr>
+            </w:pPr>
+          </w:p>
+          <w:p>
+            <w:pPr>
+              <w:jc w:val="center"/>
+              <w:rPr>
+                <w:rFonts w:ascii="Arial" w:hAnsi="Arial" w:cs="Arial"/>
+                <w:lang w:val="es-ES"/>
+              </w:rPr>
+            </w:pPr>
+            <w:r>
+              <w:rPr>
+                <w:rFonts w:ascii="Arial" w:hAnsi="Arial" w:cs="Arial"/>
+                <w:lang w:val="es-ES"/>
+              </w:rPr>
+              <w:t>El sistema la solicitud de paz y salvo y notifica el error.</w:t>
+            </w:r>
+          </w:p>
+        </w:tc>
+        <w:tc>
+          <w:tcPr>
+            <w:tcW w:w="2077" w:type="dxa"/>
+          </w:tcPr>
+          <w:p>
+            <w:pPr>
+              <w:jc w:val="center"/>
+              <w:rPr>
+                <w:rFonts w:ascii="Arial" w:hAnsi="Arial" w:cs="Arial"/>
+                <w:lang w:val="es-ES"/>
+              </w:rPr>
+            </w:pPr>
+          </w:p>
+        </w:tc>
+      </w:tr>
+      <w:tr>
+        <w:tc>
+          <w:tcPr>
+            <w:tcW w:w="1617" w:type="dxa"/>
+          </w:tcPr>
+          <w:p>
+            <w:pPr>
+              <w:jc w:val="center"/>
+              <w:rPr>
+                <w:rFonts w:ascii="Arial" w:hAnsi="Arial" w:cs="Arial"/>
+                <w:lang w:val="es-ES"/>
+              </w:rPr>
+            </w:pPr>
+          </w:p>
+          <w:p>
+            <w:pPr>
+              <w:jc w:val="center"/>
+              <w:rPr>
+                <w:rFonts w:ascii="Arial" w:hAnsi="Arial" w:cs="Arial"/>
+                <w:lang w:val="es-ES"/>
+              </w:rPr>
+            </w:pPr>
+            <w:r>
+              <w:rPr>
+                <w:rFonts w:ascii="Arial" w:hAnsi="Arial" w:cs="Arial"/>
+                <w:lang w:val="es-ES"/>
+              </w:rPr>
+              <w:t>CP-19</w:t>
+            </w:r>
+          </w:p>
+        </w:tc>
+        <w:tc>
+          <w:tcPr>
+            <w:tcW w:w="2074" w:type="dxa"/>
+          </w:tcPr>
+          <w:p>
+            <w:pPr>
+              <w:jc w:val="center"/>
+              <w:rPr>
+                <w:rFonts w:ascii="Arial" w:hAnsi="Arial" w:cs="Arial"/>
+                <w:lang w:val="es-ES"/>
+              </w:rPr>
+            </w:pPr>
+          </w:p>
+          <w:p>
+            <w:pPr>
+              <w:jc w:val="center"/>
+              <w:rPr>
+                <w:rFonts w:ascii="Arial" w:hAnsi="Arial" w:cs="Arial"/>
+                <w:lang w:val="es-ES"/>
+              </w:rPr>
+            </w:pPr>
+            <w:r>
+              <w:rPr>
+                <w:rFonts w:ascii="Arial" w:hAnsi="Arial" w:cs="Arial"/>
+                <w:lang w:val="es-ES"/>
+              </w:rPr>
+              <w:t>RF-09</w:t>
+            </w:r>
+          </w:p>
+        </w:tc>
+        <w:tc>
+          <w:tcPr>
+            <w:tcW w:w="1651" w:type="dxa"/>
+          </w:tcPr>
+          <w:p>
+            <w:pPr>
+              <w:jc w:val="center"/>
+              <w:rPr>
+                <w:rFonts w:ascii="Arial" w:hAnsi="Arial" w:cs="Arial"/>
+                <w:lang w:val="es-ES"/>
+              </w:rPr>
+            </w:pPr>
+            <w:r>
+              <w:rPr>
+                <w:rFonts w:ascii="Arial" w:hAnsi="Arial" w:cs="Arial"/>
+                <w:lang w:val="es-ES"/>
+              </w:rPr>
+              <w:t>Sesión activa y certificado que ya fue generado.</w:t>
+            </w:r>
+          </w:p>
+        </w:tc>
+        <w:tc>
+          <w:tcPr>
+            <w:tcW w:w="2924" w:type="dxa"/>
+          </w:tcPr>
+          <w:p>
+            <w:pPr>
+              <w:jc w:val="center"/>
+              <w:rPr>
+                <w:rFonts w:ascii="Arial" w:hAnsi="Arial" w:cs="Arial"/>
+                <w:lang w:val="es-ES"/>
+              </w:rPr>
+            </w:pPr>
+          </w:p>
+          <w:p>
+            <w:pPr>
+              <w:jc w:val="center"/>
+              <w:rPr>
+                <w:rFonts w:ascii="Arial" w:hAnsi="Arial" w:cs="Arial"/>
+                <w:lang w:val="es-ES"/>
+              </w:rPr>
+            </w:pPr>
+            <w:r>
+              <w:rPr>
+                <w:rFonts w:ascii="Arial" w:hAnsi="Arial" w:cs="Arial"/>
+                <w:lang w:val="es-ES"/>
+              </w:rPr>
+              <w:t>Permite la descarga del certificado.</w:t>
+            </w:r>
+          </w:p>
+        </w:tc>
+        <w:tc>
+          <w:tcPr>
+            <w:tcW w:w="2077" w:type="dxa"/>
+          </w:tcPr>
+          <w:p>
+            <w:pPr>
+              <w:jc w:val="center"/>
+              <w:rPr>
+                <w:rFonts w:ascii="Arial" w:hAnsi="Arial" w:cs="Arial"/>
+                <w:lang w:val="es-ES"/>
+              </w:rPr>
+            </w:pPr>
+          </w:p>
+        </w:tc>
+      </w:tr>
+      <w:tr>
+        <w:tc>
+          <w:tcPr>
+            <w:tcW w:w="1617" w:type="dxa"/>
+          </w:tcPr>
+          <w:p>
+            <w:pPr>
+              <w:jc w:val="center"/>
+              <w:rPr>
+                <w:rFonts w:ascii="Arial" w:hAnsi="Arial" w:cs="Arial"/>
+                <w:lang w:val="es-ES"/>
+              </w:rPr>
+            </w:pPr>
+          </w:p>
+          <w:p>
+            <w:pPr>
+              <w:jc w:val="center"/>
+              <w:rPr>
+                <w:rFonts w:ascii="Arial" w:hAnsi="Arial" w:cs="Arial"/>
+                <w:lang w:val="es-ES"/>
+              </w:rPr>
+            </w:pPr>
+            <w:r>
+              <w:rPr>
+                <w:rFonts w:ascii="Arial" w:hAnsi="Arial" w:cs="Arial"/>
+                <w:lang w:val="es-ES"/>
+              </w:rPr>
+              <w:t>CP-20</w:t>
+            </w:r>
+          </w:p>
+        </w:tc>
+        <w:tc>
+          <w:tcPr>
+            <w:tcW w:w="2074" w:type="dxa"/>
+          </w:tcPr>
+          <w:p>
+            <w:pPr>
+              <w:jc w:val="center"/>
+              <w:rPr>
+                <w:rFonts w:ascii="Arial" w:hAnsi="Arial" w:cs="Arial"/>
+                <w:lang w:val="es-ES"/>
+              </w:rPr>
+            </w:pPr>
+          </w:p>
+          <w:p>
+            <w:pPr>
+              <w:jc w:val="center"/>
+              <w:rPr>
+                <w:rFonts w:ascii="Arial" w:hAnsi="Arial" w:cs="Arial"/>
+                <w:lang w:val="es-ES"/>
+              </w:rPr>
+            </w:pPr>
+            <w:r>
+              <w:rPr>
+                <w:rFonts w:ascii="Arial" w:hAnsi="Arial" w:cs="Arial"/>
+                <w:lang w:val="es-ES"/>
+              </w:rPr>
+              <w:t>RF-09</w:t>
+            </w:r>
+          </w:p>
+        </w:tc>
+        <w:tc>
+          <w:tcPr>
+            <w:tcW w:w="1651" w:type="dxa"/>
+          </w:tcPr>
+          <w:p>
+            <w:pPr>
+              <w:jc w:val="center"/>
+              <w:rPr>
+                <w:rFonts w:ascii="Arial" w:hAnsi="Arial" w:cs="Arial"/>
+                <w:lang w:val="es-ES"/>
+              </w:rPr>
+            </w:pPr>
+            <w:r>
+              <w:rPr>
+                <w:rFonts w:ascii="Arial" w:hAnsi="Arial" w:cs="Arial"/>
+                <w:lang w:val="es-ES"/>
+              </w:rPr>
+              <w:t>Sesión activa con certificado aún no generado.</w:t>
+            </w:r>
+          </w:p>
+        </w:tc>
+        <w:tc>
+          <w:tcPr>
+            <w:tcW w:w="2924" w:type="dxa"/>
+          </w:tcPr>
+          <w:p>
+            <w:pPr>
+              <w:jc w:val="center"/>
+              <w:rPr>
+                <w:rFonts w:ascii="Arial" w:hAnsi="Arial" w:cs="Arial"/>
+                <w:lang w:val="es-ES"/>
+              </w:rPr>
+            </w:pPr>
+          </w:p>
+          <w:p>
+            <w:pPr>
+              <w:jc w:val="center"/>
+              <w:rPr>
+                <w:rFonts w:ascii="Arial" w:hAnsi="Arial" w:cs="Arial"/>
+                <w:lang w:val="es-ES"/>
+              </w:rPr>
+            </w:pPr>
+            <w:r>
+              <w:rPr>
+                <w:rFonts w:ascii="Arial" w:hAnsi="Arial" w:cs="Arial"/>
+                <w:lang w:val="es-ES"/>
+              </w:rPr>
+              <w:t>El sistema rechaza la descarga y notifica el error.</w:t>
+            </w:r>
+          </w:p>
+        </w:tc>
+        <w:tc>
+          <w:tcPr>
+            <w:tcW w:w="2077" w:type="dxa"/>
+          </w:tcPr>
+          <w:p>
+            <w:pPr>
+              <w:jc w:val="center"/>
+              <w:rPr>
+                <w:rFonts w:ascii="Arial" w:hAnsi="Arial" w:cs="Arial"/>
+                <w:lang w:val="es-ES"/>
+              </w:rPr>
+            </w:pPr>
+          </w:p>
+        </w:tc>
+      </w:tr>
+      <w:tr>
+        <w:tc>
+          <w:tcPr>
+            <w:tcW w:w="1617" w:type="dxa"/>
+          </w:tcPr>
+          <w:p>
+            <w:pPr>
+              <w:jc w:val="center"/>
+              <w:rPr>
+                <w:rFonts w:ascii="Arial" w:hAnsi="Arial" w:cs="Arial"/>
+                <w:lang w:val="es-ES"/>
+              </w:rPr>
+            </w:pPr>
+            <w:r>
+              <w:rPr>
+                <w:rFonts w:ascii="Arial" w:hAnsi="Arial" w:cs="Arial"/>
+                <w:lang w:val="es-ES"/>
+              </w:rPr>
+              <w:t>CP-21</w:t>
+            </w:r>
+          </w:p>
+        </w:tc>
+        <w:tc>
+          <w:tcPr>
+            <w:tcW w:w="2074" w:type="dxa"/>
+          </w:tcPr>
+          <w:p>
+            <w:pPr>
+              <w:jc w:val="center"/>
+              <w:rPr>
+                <w:rFonts w:ascii="Arial" w:hAnsi="Arial" w:cs="Arial"/>
+                <w:lang w:val="es-ES"/>
+              </w:rPr>
+            </w:pPr>
+            <w:r>
+              <w:rPr>
+                <w:rFonts w:ascii="Arial" w:hAnsi="Arial" w:cs="Arial"/>
+                <w:lang w:val="es-ES"/>
+              </w:rPr>
+              <w:t>RF-10</w:t>
+            </w:r>
+          </w:p>
+        </w:tc>
+        <w:tc>
+          <w:tcPr>
+            <w:tcW w:w="1651" w:type="dxa"/>
+          </w:tcPr>
+          <w:p>
+            <w:pPr>
+              <w:jc w:val="center"/>
+              <w:rPr>
+                <w:rFonts w:ascii="Arial" w:hAnsi="Arial" w:cs="Arial"/>
+                <w:lang w:val="es-ES"/>
+              </w:rPr>
+            </w:pPr>
+            <w:r>
+              <w:rPr>
+                <w:rFonts w:ascii="Arial" w:hAnsi="Arial" w:cs="Arial"/>
+                <w:lang w:val="es-ES"/>
+              </w:rPr>
+              <w:t>Sesión activa y solicitud existente sin responder.</w:t>
+            </w:r>
+          </w:p>
+        </w:tc>
+        <w:tc>
+          <w:tcPr>
+            <w:tcW w:w="2924" w:type="dxa"/>
+          </w:tcPr>
+          <w:p>
+            <w:pPr>
+              <w:jc w:val="center"/>
+              <w:rPr>
+                <w:rFonts w:ascii="Arial" w:hAnsi="Arial" w:cs="Arial"/>
+                <w:lang w:val="es-ES"/>
+              </w:rPr>
+            </w:pPr>
+            <w:r>
+              <w:rPr>
+                <w:rFonts w:ascii="Arial" w:hAnsi="Arial" w:cs="Arial"/>
+                <w:lang w:val="es-ES"/>
+              </w:rPr>
+              <w:t>Cancela la solicitud correctamente.</w:t>
+            </w:r>
+          </w:p>
+        </w:tc>
+        <w:tc>
+          <w:tcPr>
+            <w:tcW w:w="2077" w:type="dxa"/>
+          </w:tcPr>
+          <w:p>
+            <w:pPr>
+              <w:jc w:val="center"/>
+              <w:rPr>
+                <w:rFonts w:ascii="Arial" w:hAnsi="Arial" w:cs="Arial"/>
+                <w:lang w:val="es-ES"/>
+              </w:rPr>
+            </w:pPr>
+          </w:p>
+        </w:tc>
+      </w:tr>
+      <w:tr>
+        <w:tc>
+          <w:tcPr>
+            <w:tcW w:w="1617" w:type="dxa"/>
+          </w:tcPr>
+          <w:p>
+            <w:pPr>
+              <w:jc w:val="center"/>
+              <w:rPr>
+                <w:rFonts w:ascii="Arial" w:hAnsi="Arial" w:cs="Arial"/>
+                <w:lang w:val="es-ES"/>
+              </w:rPr>
+            </w:pPr>
+            <w:r>
+              <w:rPr>
+                <w:rFonts w:ascii="Arial" w:hAnsi="Arial" w:cs="Arial"/>
+                <w:lang w:val="es-ES"/>
+              </w:rPr>
+              <w:t>CP-22</w:t>
+            </w:r>
+          </w:p>
+        </w:tc>
+        <w:tc>
+          <w:tcPr>
+            <w:tcW w:w="2074" w:type="dxa"/>
+          </w:tcPr>
+          <w:p>
+            <w:pPr>
+              <w:jc w:val="center"/>
+              <w:rPr>
+                <w:rFonts w:ascii="Arial" w:hAnsi="Arial" w:cs="Arial"/>
+                <w:lang w:val="es-ES"/>
+              </w:rPr>
+            </w:pPr>
+            <w:r>
+              <w:rPr>
+                <w:rFonts w:ascii="Arial" w:hAnsi="Arial" w:cs="Arial"/>
+                <w:lang w:val="es-ES"/>
+              </w:rPr>
+              <w:t>RF-10</w:t>
+            </w:r>
+          </w:p>
+        </w:tc>
+        <w:tc>
+          <w:tcPr>
+            <w:tcW w:w="1651" w:type="dxa"/>
+          </w:tcPr>
+          <w:p>
+            <w:pPr>
+              <w:jc w:val="center"/>
+              <w:rPr>
+                <w:rFonts w:ascii="Arial" w:hAnsi="Arial" w:cs="Arial"/>
+                <w:lang w:val="es-ES"/>
+              </w:rPr>
+            </w:pPr>
+            <w:r>
+              <w:rPr>
+                <w:rFonts w:ascii="Arial" w:hAnsi="Arial" w:cs="Arial"/>
+                <w:lang w:val="es-ES"/>
+              </w:rPr>
+              <w:t>Intento de cancelar una solicitud ya respondida.</w:t>
+            </w:r>
+          </w:p>
+        </w:tc>
+        <w:tc>
+          <w:tcPr>
+            <w:tcW w:w="2924" w:type="dxa"/>
+          </w:tcPr>
+          <w:p>
+            <w:pPr>
+              <w:jc w:val="center"/>
+              <w:rPr>
+                <w:rFonts w:ascii="Arial" w:hAnsi="Arial" w:cs="Arial"/>
+                <w:lang w:val="es-ES"/>
+              </w:rPr>
+            </w:pPr>
+            <w:r>
+              <w:rPr>
+                <w:rFonts w:ascii="Arial" w:hAnsi="Arial" w:cs="Arial"/>
+                <w:lang w:val="es-ES"/>
+              </w:rPr>
+              <w:t>El sistema rechaza la cancelación.</w:t>
+            </w:r>
+          </w:p>
+        </w:tc>
+        <w:tc>
+          <w:tcPr>
+            <w:tcW w:w="2077" w:type="dxa"/>
+          </w:tcPr>
+          <w:p>
+            <w:pPr>
+              <w:jc w:val="center"/>
+              <w:rPr>
+                <w:rFonts w:ascii="Arial" w:hAnsi="Arial" w:cs="Arial"/>
+                <w:lang w:val="es-ES"/>
+              </w:rPr>
+            </w:pPr>
+          </w:p>
+        </w:tc>
+      </w:tr>
+      <w:tr>
+        <w:tc>
+          <w:tcPr>
+            <w:tcW w:w="1617" w:type="dxa"/>
+          </w:tcPr>
+          <w:p>
+            <w:pPr>
+              <w:jc w:val="center"/>
+              <w:rPr>
+                <w:rFonts w:ascii="Arial" w:hAnsi="Arial" w:cs="Arial"/>
+                <w:lang w:val="es-ES"/>
+              </w:rPr>
+            </w:pPr>
+          </w:p>
+          <w:p>
+            <w:pPr>
+              <w:jc w:val="center"/>
+              <w:rPr>
+                <w:rFonts w:ascii="Arial" w:hAnsi="Arial" w:cs="Arial"/>
+                <w:lang w:val="es-ES"/>
+              </w:rPr>
+            </w:pPr>
+          </w:p>
+          <w:p>
+            <w:pPr>
+              <w:jc w:val="center"/>
+              <w:rPr>
+                <w:rFonts w:ascii="Arial" w:hAnsi="Arial" w:cs="Arial"/>
+                <w:lang w:val="es-ES"/>
+              </w:rPr>
+            </w:pPr>
+          </w:p>
+          <w:p>
+            <w:pPr>
+              <w:jc w:val="center"/>
+              <w:rPr>
+                <w:rFonts w:ascii="Arial" w:hAnsi="Arial" w:cs="Arial"/>
+                <w:lang w:val="es-ES"/>
+              </w:rPr>
+            </w:pPr>
+            <w:r>
+              <w:rPr>
+                <w:rFonts w:ascii="Arial" w:hAnsi="Arial" w:cs="Arial"/>
+                <w:lang w:val="es-ES"/>
+              </w:rPr>
+              <w:t>CP-23</w:t>
+            </w:r>
+          </w:p>
+        </w:tc>
+        <w:tc>
+          <w:tcPr>
+            <w:tcW w:w="2074" w:type="dxa"/>
+          </w:tcPr>
+          <w:p>
+            <w:pPr>
+              <w:jc w:val="center"/>
+              <w:rPr>
+                <w:rFonts w:ascii="Arial" w:hAnsi="Arial" w:cs="Arial"/>
+                <w:lang w:val="es-ES"/>
+              </w:rPr>
+            </w:pPr>
+          </w:p>
+          <w:p>
+            <w:pPr>
+              <w:jc w:val="center"/>
+              <w:rPr>
+                <w:rFonts w:ascii="Arial" w:hAnsi="Arial" w:cs="Arial"/>
+                <w:lang w:val="es-ES"/>
+              </w:rPr>
+            </w:pPr>
+          </w:p>
+          <w:p>
+            <w:pPr>
+              <w:jc w:val="center"/>
+              <w:rPr>
+                <w:rFonts w:ascii="Arial" w:hAnsi="Arial" w:cs="Arial"/>
+                <w:lang w:val="es-ES"/>
+              </w:rPr>
+            </w:pPr>
+          </w:p>
+          <w:p>
+            <w:pPr>
+              <w:jc w:val="center"/>
+              <w:rPr>
+                <w:rFonts w:ascii="Arial" w:hAnsi="Arial" w:cs="Arial"/>
+                <w:lang w:val="es-ES"/>
+              </w:rPr>
+            </w:pPr>
+            <w:r>
+              <w:rPr>
+                <w:rFonts w:ascii="Arial" w:hAnsi="Arial" w:cs="Arial"/>
+                <w:lang w:val="es-ES"/>
+              </w:rPr>
+              <w:t>RF-10</w:t>
+            </w:r>
+          </w:p>
+        </w:tc>
+        <w:tc>
+          <w:tcPr>
+            <w:tcW w:w="1651" w:type="dxa"/>
+          </w:tcPr>
+          <w:p>
+            <w:pPr>
+              <w:jc w:val="center"/>
+              <w:rPr>
+                <w:rFonts w:ascii="Arial" w:hAnsi="Arial" w:cs="Arial"/>
+                <w:lang w:val="es-ES"/>
+              </w:rPr>
+            </w:pPr>
+            <w:r>
+              <w:rPr>
+                <w:rFonts w:ascii="Arial" w:hAnsi="Arial" w:cs="Arial"/>
+                <w:lang w:val="es-ES"/>
+              </w:rPr>
+              <w:t>Intento de cancelar una solicitud con un identificador inexistente.</w:t>
+            </w:r>
+          </w:p>
+        </w:tc>
+        <w:tc>
+          <w:tcPr>
+            <w:tcW w:w="2924" w:type="dxa"/>
+          </w:tcPr>
+          <w:p>
+            <w:pPr>
+              <w:jc w:val="center"/>
+              <w:rPr>
+                <w:rFonts w:ascii="Arial" w:hAnsi="Arial" w:cs="Arial"/>
+                <w:lang w:val="es-ES"/>
+              </w:rPr>
+            </w:pPr>
+          </w:p>
+          <w:p>
+            <w:pPr>
+              <w:jc w:val="center"/>
+              <w:rPr>
+                <w:rFonts w:ascii="Arial" w:hAnsi="Arial" w:cs="Arial"/>
+                <w:lang w:val="es-ES"/>
+              </w:rPr>
+            </w:pPr>
+          </w:p>
+          <w:p>
+            <w:pPr>
+              <w:jc w:val="center"/>
+              <w:rPr>
+                <w:rFonts w:ascii="Arial" w:hAnsi="Arial" w:cs="Arial"/>
+                <w:lang w:val="es-ES"/>
+              </w:rPr>
+            </w:pPr>
+            <w:r>
+              <w:rPr>
+                <w:rFonts w:ascii="Arial" w:hAnsi="Arial" w:cs="Arial"/>
+                <w:lang w:val="es-ES"/>
+              </w:rPr>
+              <w:t>El sistema muestra un error de solicitud no encontrada.</w:t>
+            </w:r>
+          </w:p>
+        </w:tc>
+        <w:tc>
+          <w:tcPr>
+            <w:tcW w:w="2077" w:type="dxa"/>
+          </w:tcPr>
+          <w:p>
+            <w:pPr>
+              <w:jc w:val="center"/>
+              <w:rPr>
+                <w:rFonts w:ascii="Arial" w:hAnsi="Arial" w:cs="Arial"/>
+                <w:lang w:val="es-ES"/>
+              </w:rPr>
+            </w:pPr>
+          </w:p>
+        </w:tc>
+      </w:tr>
+      <w:tr>
+        <w:tc>
+          <w:tcPr>
+            <w:tcW w:w="1617" w:type="dxa"/>
+          </w:tcPr>
+          <w:p>
+            <w:pPr>
+              <w:jc w:val="center"/>
+              <w:rPr>
+                <w:rFonts w:ascii="Arial" w:hAnsi="Arial" w:cs="Arial"/>
+                <w:lang w:val="es-ES"/>
+              </w:rPr>
+            </w:pPr>
+          </w:p>
+          <w:p>
+            <w:pPr>
+              <w:jc w:val="center"/>
+              <w:rPr>
+                <w:rFonts w:ascii="Arial" w:hAnsi="Arial" w:cs="Arial"/>
+                <w:lang w:val="es-ES"/>
+              </w:rPr>
+            </w:pPr>
+            <w:r>
+              <w:rPr>
+                <w:rFonts w:ascii="Arial" w:hAnsi="Arial" w:cs="Arial"/>
+                <w:lang w:val="es-ES"/>
+              </w:rPr>
+              <w:t>CP-24</w:t>
+            </w:r>
+          </w:p>
+        </w:tc>
+        <w:tc>
+          <w:tcPr>
+            <w:tcW w:w="2074" w:type="dxa"/>
+          </w:tcPr>
+          <w:p>
+            <w:pPr>
+              <w:jc w:val="center"/>
+              <w:rPr>
+                <w:rFonts w:ascii="Arial" w:hAnsi="Arial" w:cs="Arial"/>
+                <w:lang w:val="es-ES"/>
+              </w:rPr>
+            </w:pPr>
+          </w:p>
+          <w:p>
+            <w:pPr>
+              <w:jc w:val="center"/>
+              <w:rPr>
+                <w:rFonts w:ascii="Arial" w:hAnsi="Arial" w:cs="Arial"/>
+                <w:lang w:val="es-ES"/>
+              </w:rPr>
+            </w:pPr>
+            <w:r>
+              <w:rPr>
+                <w:rFonts w:ascii="Arial" w:hAnsi="Arial" w:cs="Arial"/>
+                <w:lang w:val="es-ES"/>
+              </w:rPr>
+              <w:t>RF-11</w:t>
+            </w:r>
+          </w:p>
+        </w:tc>
+        <w:tc>
+          <w:tcPr>
+            <w:tcW w:w="1651" w:type="dxa"/>
+          </w:tcPr>
+          <w:p>
+            <w:pPr>
+              <w:jc w:val="center"/>
+              <w:rPr>
+                <w:rFonts w:ascii="Arial" w:hAnsi="Arial" w:cs="Arial"/>
+                <w:lang w:val="es-ES"/>
+              </w:rPr>
+            </w:pPr>
+            <w:r>
+              <w:rPr>
+                <w:rFonts w:ascii="Arial" w:hAnsi="Arial" w:cs="Arial"/>
+                <w:lang w:val="es-ES"/>
+              </w:rPr>
+              <w:t>Sesión activa y datos nuevos que son válidos.</w:t>
+            </w:r>
+          </w:p>
+        </w:tc>
+        <w:tc>
+          <w:tcPr>
+            <w:tcW w:w="2924" w:type="dxa"/>
+          </w:tcPr>
+          <w:p>
+            <w:pPr>
+              <w:jc w:val="center"/>
+              <w:rPr>
+                <w:rFonts w:ascii="Arial" w:hAnsi="Arial" w:cs="Arial"/>
+                <w:lang w:val="es-ES"/>
+              </w:rPr>
+            </w:pPr>
+          </w:p>
+          <w:p>
+            <w:pPr>
+              <w:jc w:val="center"/>
+              <w:rPr>
+                <w:rFonts w:ascii="Arial" w:hAnsi="Arial" w:cs="Arial"/>
+                <w:lang w:val="es-ES"/>
+              </w:rPr>
+            </w:pPr>
+            <w:r>
+              <w:rPr>
+                <w:rFonts w:ascii="Arial" w:hAnsi="Arial" w:cs="Arial"/>
+                <w:lang w:val="es-ES"/>
+              </w:rPr>
+              <w:t>Actualiza la información personal del estudiante.</w:t>
+            </w:r>
+          </w:p>
+        </w:tc>
+        <w:tc>
+          <w:tcPr>
+            <w:tcW w:w="2077" w:type="dxa"/>
+          </w:tcPr>
+          <w:p>
+            <w:pPr>
+              <w:jc w:val="center"/>
+              <w:rPr>
+                <w:rFonts w:ascii="Arial" w:hAnsi="Arial" w:cs="Arial"/>
+                <w:lang w:val="es-ES"/>
+              </w:rPr>
+            </w:pPr>
+          </w:p>
+        </w:tc>
+      </w:tr>
+      <w:tr>
+        <w:tc>
+          <w:tcPr>
+            <w:tcW w:w="1617" w:type="dxa"/>
+          </w:tcPr>
+          <w:p>
+            <w:pPr>
+              <w:jc w:val="center"/>
+              <w:rPr>
+                <w:rFonts w:ascii="Arial" w:hAnsi="Arial" w:cs="Arial"/>
+                <w:lang w:val="es-ES"/>
+              </w:rPr>
+            </w:pPr>
+          </w:p>
+          <w:p>
+            <w:pPr>
+              <w:jc w:val="center"/>
+              <w:rPr>
+                <w:rFonts w:ascii="Arial" w:hAnsi="Arial" w:cs="Arial"/>
+                <w:lang w:val="es-ES"/>
+              </w:rPr>
+            </w:pPr>
+          </w:p>
+          <w:p>
+            <w:pPr>
+              <w:jc w:val="center"/>
+              <w:rPr>
+                <w:rFonts w:ascii="Arial" w:hAnsi="Arial" w:cs="Arial"/>
+                <w:lang w:val="es-ES"/>
+              </w:rPr>
+            </w:pPr>
+            <w:r>
+              <w:rPr>
+                <w:rFonts w:ascii="Arial" w:hAnsi="Arial" w:cs="Arial"/>
+                <w:lang w:val="es-ES"/>
+              </w:rPr>
+              <w:t>CP-25</w:t>
+            </w:r>
+          </w:p>
+        </w:tc>
+        <w:tc>
+          <w:tcPr>
+            <w:tcW w:w="2074" w:type="dxa"/>
+          </w:tcPr>
+          <w:p>
+            <w:pPr>
+              <w:jc w:val="center"/>
+              <w:rPr>
+                <w:rFonts w:ascii="Arial" w:hAnsi="Arial" w:cs="Arial"/>
+                <w:lang w:val="es-ES"/>
+              </w:rPr>
+            </w:pPr>
+          </w:p>
+          <w:p>
+            <w:pPr>
+              <w:jc w:val="center"/>
+              <w:rPr>
+                <w:rFonts w:ascii="Arial" w:hAnsi="Arial" w:cs="Arial"/>
+                <w:lang w:val="es-ES"/>
+              </w:rPr>
+            </w:pPr>
+          </w:p>
+          <w:p>
+            <w:pPr>
+              <w:jc w:val="center"/>
+              <w:rPr>
+                <w:rFonts w:ascii="Arial" w:hAnsi="Arial" w:cs="Arial"/>
+                <w:lang w:val="es-ES"/>
+              </w:rPr>
+            </w:pPr>
+            <w:r>
+              <w:rPr>
+                <w:rFonts w:ascii="Arial" w:hAnsi="Arial" w:cs="Arial"/>
+                <w:lang w:val="es-ES"/>
+              </w:rPr>
+              <w:t>RF-11</w:t>
+            </w:r>
+          </w:p>
+        </w:tc>
+        <w:tc>
+          <w:tcPr>
+            <w:tcW w:w="1651" w:type="dxa"/>
+          </w:tcPr>
+          <w:p>
+            <w:pPr>
+              <w:jc w:val="center"/>
+              <w:rPr>
+                <w:rFonts w:ascii="Arial" w:hAnsi="Arial" w:cs="Arial"/>
+                <w:lang w:val="es-ES"/>
+              </w:rPr>
+            </w:pPr>
+            <w:r>
+              <w:rPr>
+                <w:rFonts w:ascii="Arial" w:hAnsi="Arial" w:cs="Arial"/>
+                <w:lang w:val="es-ES"/>
+              </w:rPr>
+              <w:t>Sesión activa con datos nuevos en formatos incorrectos.</w:t>
+            </w:r>
+          </w:p>
+        </w:tc>
+        <w:tc>
+          <w:tcPr>
+            <w:tcW w:w="2924" w:type="dxa"/>
+          </w:tcPr>
+          <w:p>
+            <w:pPr>
+              <w:jc w:val="center"/>
+              <w:rPr>
+                <w:rFonts w:ascii="Arial" w:hAnsi="Arial" w:cs="Arial"/>
+                <w:lang w:val="es-ES"/>
+              </w:rPr>
+            </w:pPr>
+          </w:p>
+          <w:p>
+            <w:pPr>
+              <w:jc w:val="center"/>
+              <w:rPr>
+                <w:rFonts w:ascii="Arial" w:hAnsi="Arial" w:cs="Arial"/>
+                <w:lang w:val="es-ES"/>
+              </w:rPr>
+            </w:pPr>
+            <w:r>
+              <w:rPr>
+                <w:rFonts w:ascii="Arial" w:hAnsi="Arial" w:cs="Arial"/>
+                <w:lang w:val="es-ES"/>
+              </w:rPr>
+              <w:t>El sistema rechaza la actualización y muestra error de validación.</w:t>
+            </w:r>
+          </w:p>
+        </w:tc>
+        <w:tc>
+          <w:tcPr>
+            <w:tcW w:w="2077" w:type="dxa"/>
+          </w:tcPr>
+          <w:p>
+            <w:pPr>
+              <w:jc w:val="center"/>
+              <w:rPr>
+                <w:rFonts w:ascii="Arial" w:hAnsi="Arial" w:cs="Arial"/>
+                <w:lang w:val="es-ES"/>
+              </w:rPr>
+            </w:pPr>
+          </w:p>
+        </w:tc>
+      </w:tr>
+      <w:tr>
+        <w:tc>
+          <w:tcPr>
+            <w:tcW w:w="1617" w:type="dxa"/>
+          </w:tcPr>
+          <w:p>
+            <w:pPr>
+              <w:rPr>
+                <w:rFonts w:ascii="Arial" w:hAnsi="Arial" w:cs="Arial"/>
+                <w:lang w:val="es-ES"/>
+              </w:rPr>
+            </w:pPr>
+          </w:p>
+          <w:p>
+            <w:pPr>
+              <w:jc w:val="center"/>
+              <w:rPr>
+                <w:rFonts w:ascii="Arial" w:hAnsi="Arial" w:cs="Arial"/>
+                <w:lang w:val="es-ES"/>
+              </w:rPr>
+            </w:pPr>
+          </w:p>
+          <w:p>
+            <w:pPr>
+              <w:jc w:val="center"/>
+              <w:rPr>
+                <w:rFonts w:ascii="Arial" w:hAnsi="Arial" w:cs="Arial"/>
+                <w:lang w:val="es-ES"/>
+              </w:rPr>
+            </w:pPr>
+            <w:r>
+              <w:rPr>
+                <w:rFonts w:ascii="Arial" w:hAnsi="Arial" w:cs="Arial"/>
+                <w:lang w:val="es-ES"/>
+              </w:rPr>
+              <w:t>CP-26</w:t>
+            </w:r>
+          </w:p>
+        </w:tc>
+        <w:tc>
+          <w:tcPr>
+            <w:tcW w:w="2074" w:type="dxa"/>
+          </w:tcPr>
+          <w:p>
+            <w:pPr>
+              <w:jc w:val="center"/>
+              <w:rPr>
+                <w:rFonts w:ascii="Arial" w:hAnsi="Arial" w:cs="Arial"/>
+                <w:lang w:val="es-ES"/>
+              </w:rPr>
+            </w:pPr>
+          </w:p>
+          <w:p>
+            <w:pPr>
+              <w:jc w:val="center"/>
+              <w:rPr>
+                <w:rFonts w:ascii="Arial" w:hAnsi="Arial" w:cs="Arial"/>
+                <w:lang w:val="es-ES"/>
+              </w:rPr>
+            </w:pPr>
+          </w:p>
+          <w:p>
+            <w:pPr>
+              <w:jc w:val="center"/>
+              <w:rPr>
+                <w:rFonts w:ascii="Arial" w:hAnsi="Arial" w:cs="Arial"/>
+                <w:lang w:val="es-ES"/>
+              </w:rPr>
+            </w:pPr>
+          </w:p>
+          <w:p>
+            <w:pPr>
+              <w:jc w:val="center"/>
+              <w:rPr>
+                <w:rFonts w:ascii="Arial" w:hAnsi="Arial" w:cs="Arial"/>
+                <w:lang w:val="es-ES"/>
+              </w:rPr>
+            </w:pPr>
+            <w:r>
+              <w:rPr>
+                <w:rFonts w:ascii="Arial" w:hAnsi="Arial" w:cs="Arial"/>
+                <w:lang w:val="es-ES"/>
+              </w:rPr>
+              <w:t>RF-12</w:t>
+            </w:r>
+          </w:p>
+        </w:tc>
+        <w:tc>
+          <w:tcPr>
+            <w:tcW w:w="1651" w:type="dxa"/>
+          </w:tcPr>
+          <w:p>
+            <w:pPr>
+              <w:jc w:val="center"/>
+              <w:rPr>
+                <w:rFonts w:ascii="Arial" w:hAnsi="Arial" w:cs="Arial"/>
+                <w:lang w:val="es-ES"/>
+              </w:rPr>
+            </w:pPr>
+            <w:r>
+              <w:rPr>
+                <w:rFonts w:ascii="Arial" w:hAnsi="Arial" w:cs="Arial"/>
+                <w:lang w:val="es-ES"/>
+              </w:rPr>
+              <w:t xml:space="preserve">El estudiante marca el </w:t>
+            </w:r>
+            <w:proofErr w:type="spellStart"/>
+            <w:r>
+              <w:rPr>
+                <w:rFonts w:ascii="Arial" w:hAnsi="Arial" w:cs="Arial"/>
+                <w:lang w:val="es-ES"/>
+              </w:rPr>
+              <w:t>checkbox</w:t>
+            </w:r>
+            <w:proofErr w:type="spellEnd"/>
+            <w:r>
+              <w:rPr>
+                <w:rFonts w:ascii="Arial" w:hAnsi="Arial" w:cs="Arial"/>
+                <w:lang w:val="es-ES"/>
+              </w:rPr>
+              <w:t xml:space="preserve"> de términos, condiciones y cookies.</w:t>
+            </w:r>
+          </w:p>
+        </w:tc>
+        <w:tc>
+          <w:tcPr>
+            <w:tcW w:w="2924" w:type="dxa"/>
+          </w:tcPr>
+          <w:p>
+            <w:pPr>
+              <w:jc w:val="center"/>
+              <w:rPr>
+                <w:rFonts w:ascii="Arial" w:hAnsi="Arial" w:cs="Arial"/>
+                <w:lang w:val="es-ES"/>
+              </w:rPr>
+            </w:pPr>
+          </w:p>
+          <w:p>
+            <w:pPr>
+              <w:jc w:val="center"/>
+              <w:rPr>
+                <w:rFonts w:ascii="Arial" w:hAnsi="Arial" w:cs="Arial"/>
+                <w:lang w:val="es-ES"/>
+              </w:rPr>
+            </w:pPr>
+          </w:p>
+          <w:p>
+            <w:pPr>
+              <w:jc w:val="center"/>
+              <w:rPr>
+                <w:rFonts w:ascii="Arial" w:hAnsi="Arial" w:cs="Arial"/>
+                <w:lang w:val="es-ES"/>
+              </w:rPr>
+            </w:pPr>
+            <w:r>
+              <w:rPr>
+                <w:rFonts w:ascii="Arial" w:hAnsi="Arial" w:cs="Arial"/>
+                <w:lang w:val="es-ES"/>
+              </w:rPr>
+              <w:t>El sistema permite continuar con el registro e ingreso.</w:t>
+            </w:r>
+          </w:p>
+        </w:tc>
+        <w:tc>
+          <w:tcPr>
+            <w:tcW w:w="2077" w:type="dxa"/>
+          </w:tcPr>
+          <w:p>
+            <w:pPr>
+              <w:jc w:val="center"/>
+              <w:rPr>
+                <w:rFonts w:ascii="Arial" w:hAnsi="Arial" w:cs="Arial"/>
+                <w:lang w:val="es-ES"/>
+              </w:rPr>
+            </w:pPr>
+          </w:p>
+        </w:tc>
+      </w:tr>
+      <w:tr>
+        <w:tc>
+          <w:tcPr>
+            <w:tcW w:w="1617" w:type="dxa"/>
+          </w:tcPr>
+          <w:p>
+            <w:pPr>
+              <w:jc w:val="center"/>
+              <w:rPr>
+                <w:rFonts w:ascii="Arial" w:hAnsi="Arial" w:cs="Arial"/>
+                <w:lang w:val="es-ES"/>
+              </w:rPr>
+            </w:pPr>
+          </w:p>
+          <w:p>
+            <w:pPr>
+              <w:jc w:val="center"/>
+              <w:rPr>
+                <w:rFonts w:ascii="Arial" w:hAnsi="Arial" w:cs="Arial"/>
+                <w:lang w:val="es-ES"/>
+              </w:rPr>
+            </w:pPr>
+          </w:p>
+          <w:p>
+            <w:pPr>
+              <w:jc w:val="center"/>
+              <w:rPr>
+                <w:rFonts w:ascii="Arial" w:hAnsi="Arial" w:cs="Arial"/>
+                <w:lang w:val="es-ES"/>
+              </w:rPr>
+            </w:pPr>
+            <w:r>
+              <w:rPr>
+                <w:rFonts w:ascii="Arial" w:hAnsi="Arial" w:cs="Arial"/>
+                <w:lang w:val="es-ES"/>
+              </w:rPr>
+              <w:t>CP-27</w:t>
+            </w:r>
+          </w:p>
+        </w:tc>
+        <w:tc>
+          <w:tcPr>
+            <w:tcW w:w="2074" w:type="dxa"/>
+          </w:tcPr>
+          <w:p>
+            <w:pPr>
+              <w:jc w:val="center"/>
+              <w:rPr>
+                <w:rFonts w:ascii="Arial" w:hAnsi="Arial" w:cs="Arial"/>
+                <w:lang w:val="es-ES"/>
+              </w:rPr>
+            </w:pPr>
+          </w:p>
+          <w:p>
+            <w:pPr>
+              <w:jc w:val="center"/>
+              <w:rPr>
+                <w:rFonts w:ascii="Arial" w:hAnsi="Arial" w:cs="Arial"/>
+                <w:lang w:val="es-ES"/>
+              </w:rPr>
+            </w:pPr>
+          </w:p>
+          <w:p>
+            <w:pPr>
+              <w:jc w:val="center"/>
+              <w:rPr>
+                <w:rFonts w:ascii="Arial" w:hAnsi="Arial" w:cs="Arial"/>
+                <w:lang w:val="es-ES"/>
+              </w:rPr>
+            </w:pPr>
+            <w:r>
+              <w:rPr>
+                <w:rFonts w:ascii="Arial" w:hAnsi="Arial" w:cs="Arial"/>
+                <w:lang w:val="es-ES"/>
+              </w:rPr>
+              <w:t>RF-12</w:t>
+            </w:r>
+          </w:p>
+        </w:tc>
+        <w:tc>
+          <w:tcPr>
+            <w:tcW w:w="1651" w:type="dxa"/>
+          </w:tcPr>
+          <w:p>
+            <w:pPr>
+              <w:jc w:val="center"/>
+              <w:rPr>
+                <w:rFonts w:ascii="Arial" w:hAnsi="Arial" w:cs="Arial"/>
+                <w:lang w:val="es-ES"/>
+              </w:rPr>
+            </w:pPr>
+            <w:r>
+              <w:rPr>
+                <w:rFonts w:ascii="Arial" w:hAnsi="Arial" w:cs="Arial"/>
+                <w:lang w:val="es-ES"/>
+              </w:rPr>
+              <w:t xml:space="preserve">Estudiante intenta continuar sin marca el </w:t>
+            </w:r>
+            <w:proofErr w:type="spellStart"/>
+            <w:r>
+              <w:rPr>
+                <w:rFonts w:ascii="Arial" w:hAnsi="Arial" w:cs="Arial"/>
+                <w:lang w:val="es-ES"/>
+              </w:rPr>
+              <w:t>checkbox</w:t>
+            </w:r>
+            <w:proofErr w:type="spellEnd"/>
+            <w:r>
+              <w:rPr>
+                <w:rFonts w:ascii="Arial" w:hAnsi="Arial" w:cs="Arial"/>
+                <w:lang w:val="es-ES"/>
+              </w:rPr>
+              <w:t>.</w:t>
+            </w:r>
+          </w:p>
+        </w:tc>
+        <w:tc>
+          <w:tcPr>
+            <w:tcW w:w="2924" w:type="dxa"/>
+          </w:tcPr>
+          <w:p>
+            <w:pPr>
+              <w:jc w:val="center"/>
+              <w:rPr>
+                <w:rFonts w:ascii="Arial" w:hAnsi="Arial" w:cs="Arial"/>
+                <w:lang w:val="es-ES"/>
+              </w:rPr>
+            </w:pPr>
+          </w:p>
+          <w:p>
+            <w:pPr>
+              <w:jc w:val="center"/>
+              <w:rPr>
+                <w:rFonts w:ascii="Arial" w:hAnsi="Arial" w:cs="Arial"/>
+                <w:lang w:val="es-ES"/>
+              </w:rPr>
+            </w:pPr>
+            <w:r>
+              <w:rPr>
+                <w:rFonts w:ascii="Arial" w:hAnsi="Arial" w:cs="Arial"/>
+                <w:lang w:val="es-ES"/>
+              </w:rPr>
+              <w:t>El sistema bloque el avance y exige aceptar los términos</w:t>
+            </w:r>
+          </w:p>
+        </w:tc>
+        <w:tc>
+          <w:tcPr>
+            <w:tcW w:w="2077" w:type="dxa"/>
+          </w:tcPr>
+          <w:p>
+            <w:pPr>
+              <w:jc w:val="center"/>
+              <w:rPr>
+                <w:rFonts w:ascii="Arial" w:hAnsi="Arial" w:cs="Arial"/>
+                <w:lang w:val="es-ES"/>
+              </w:rPr>
+            </w:pPr>
+          </w:p>
+        </w:tc>
+      </w:tr>
+      <w:tr>
+        <w:tc>
+          <w:tcPr>
+            <w:tcW w:w="1617" w:type="dxa"/>
+          </w:tcPr>
+          <w:p>
+            <w:pPr>
+              <w:jc w:val="center"/>
+              <w:rPr>
+                <w:rFonts w:ascii="Arial" w:hAnsi="Arial" w:cs="Arial"/>
+                <w:lang w:val="es-ES"/>
+              </w:rPr>
+            </w:pPr>
+            <w:r>
+              <w:rPr>
+                <w:rFonts w:ascii="Arial" w:hAnsi="Arial" w:cs="Arial"/>
+                <w:lang w:val="es-ES"/>
+              </w:rPr>
+              <w:t>CP-28</w:t>
+            </w:r>
+          </w:p>
+        </w:tc>
+        <w:tc>
+          <w:tcPr>
+            <w:tcW w:w="2074" w:type="dxa"/>
+          </w:tcPr>
+          <w:p>
+            <w:pPr>
+              <w:jc w:val="center"/>
+              <w:rPr>
+                <w:rFonts w:ascii="Arial" w:hAnsi="Arial" w:cs="Arial"/>
+                <w:lang w:val="es-ES"/>
+              </w:rPr>
+            </w:pPr>
+            <w:r>
+              <w:rPr>
+                <w:rFonts w:ascii="Arial" w:hAnsi="Arial" w:cs="Arial"/>
+                <w:lang w:val="es-ES"/>
+              </w:rPr>
+              <w:t>RF-13</w:t>
+            </w:r>
+          </w:p>
+        </w:tc>
+        <w:tc>
+          <w:tcPr>
+            <w:tcW w:w="1651" w:type="dxa"/>
+          </w:tcPr>
+          <w:p>
+            <w:pPr>
+              <w:jc w:val="center"/>
+              <w:rPr>
+                <w:rFonts w:ascii="Arial" w:hAnsi="Arial" w:cs="Arial"/>
+                <w:lang w:val="es-ES"/>
+              </w:rPr>
+            </w:pPr>
+            <w:r>
+              <w:rPr>
+                <w:rFonts w:ascii="Arial" w:hAnsi="Arial" w:cs="Arial"/>
+                <w:lang w:val="es-ES"/>
+              </w:rPr>
+              <w:t>Sesión activa y el identificador de solicitud es válido.</w:t>
+            </w:r>
+          </w:p>
+        </w:tc>
+        <w:tc>
+          <w:tcPr>
+            <w:tcW w:w="2924" w:type="dxa"/>
+          </w:tcPr>
+          <w:p>
+            <w:pPr>
+              <w:jc w:val="center"/>
+              <w:rPr>
+                <w:rFonts w:ascii="Arial" w:hAnsi="Arial" w:cs="Arial"/>
+                <w:lang w:val="es-ES"/>
+              </w:rPr>
+            </w:pPr>
+          </w:p>
+          <w:p>
+            <w:pPr>
+              <w:jc w:val="center"/>
+              <w:rPr>
+                <w:rFonts w:ascii="Arial" w:hAnsi="Arial" w:cs="Arial"/>
+                <w:lang w:val="es-ES"/>
+              </w:rPr>
+            </w:pPr>
+            <w:r>
+              <w:rPr>
+                <w:rFonts w:ascii="Arial" w:hAnsi="Arial" w:cs="Arial"/>
+                <w:lang w:val="es-ES"/>
+              </w:rPr>
+              <w:t>Muestra la información de la solicitud consultada.</w:t>
+            </w:r>
+          </w:p>
+        </w:tc>
+        <w:tc>
+          <w:tcPr>
+            <w:tcW w:w="2077" w:type="dxa"/>
+          </w:tcPr>
+          <w:p>
+            <w:pPr>
+              <w:jc w:val="center"/>
+              <w:rPr>
+                <w:rFonts w:ascii="Arial" w:hAnsi="Arial" w:cs="Arial"/>
+                <w:lang w:val="es-ES"/>
+              </w:rPr>
+            </w:pPr>
+          </w:p>
+        </w:tc>
+      </w:tr>
+      <w:tr>
+        <w:tc>
+          <w:tcPr>
+            <w:tcW w:w="1617" w:type="dxa"/>
+          </w:tcPr>
+          <w:p>
+            <w:pPr>
+              <w:jc w:val="center"/>
+              <w:rPr>
+                <w:rFonts w:ascii="Arial" w:hAnsi="Arial" w:cs="Arial"/>
+                <w:lang w:val="es-ES"/>
+              </w:rPr>
+            </w:pPr>
+            <w:r>
+              <w:rPr>
+                <w:rFonts w:ascii="Arial" w:hAnsi="Arial" w:cs="Arial"/>
+                <w:lang w:val="es-ES"/>
+              </w:rPr>
+              <w:t>CP-29</w:t>
+            </w:r>
+          </w:p>
+        </w:tc>
+        <w:tc>
+          <w:tcPr>
+            <w:tcW w:w="2074" w:type="dxa"/>
+          </w:tcPr>
+          <w:p>
+            <w:pPr>
+              <w:jc w:val="center"/>
+              <w:rPr>
+                <w:rFonts w:ascii="Arial" w:hAnsi="Arial" w:cs="Arial"/>
+                <w:lang w:val="es-ES"/>
+              </w:rPr>
+            </w:pPr>
+            <w:r>
+              <w:rPr>
+                <w:rFonts w:ascii="Arial" w:hAnsi="Arial" w:cs="Arial"/>
+                <w:lang w:val="es-ES"/>
+              </w:rPr>
+              <w:t>RF-13</w:t>
+            </w:r>
+          </w:p>
+        </w:tc>
+        <w:tc>
+          <w:tcPr>
+            <w:tcW w:w="1651" w:type="dxa"/>
+          </w:tcPr>
+          <w:p>
+            <w:pPr>
+              <w:jc w:val="center"/>
+              <w:rPr>
+                <w:rFonts w:ascii="Arial" w:hAnsi="Arial" w:cs="Arial"/>
+                <w:lang w:val="es-ES"/>
+              </w:rPr>
+            </w:pPr>
+            <w:r>
+              <w:rPr>
+                <w:rFonts w:ascii="Arial" w:hAnsi="Arial" w:cs="Arial"/>
+                <w:lang w:val="es-ES"/>
+              </w:rPr>
+              <w:t>Sesión activa con ID de solicitud inexistente.</w:t>
+            </w:r>
+          </w:p>
+        </w:tc>
+        <w:tc>
+          <w:tcPr>
+            <w:tcW w:w="2924" w:type="dxa"/>
+          </w:tcPr>
+          <w:p>
+            <w:pPr>
+              <w:jc w:val="center"/>
+              <w:rPr>
+                <w:rFonts w:ascii="Arial" w:hAnsi="Arial" w:cs="Arial"/>
+                <w:lang w:val="es-ES"/>
+              </w:rPr>
+            </w:pPr>
+          </w:p>
+          <w:p>
+            <w:pPr>
+              <w:jc w:val="center"/>
+              <w:rPr>
+                <w:rFonts w:ascii="Arial" w:hAnsi="Arial" w:cs="Arial"/>
+                <w:lang w:val="es-ES"/>
+              </w:rPr>
+            </w:pPr>
+            <w:r>
+              <w:rPr>
+                <w:rFonts w:ascii="Arial" w:hAnsi="Arial" w:cs="Arial"/>
+                <w:lang w:val="es-ES"/>
+              </w:rPr>
+              <w:t>El sistema muestra un error de solicitud no encontrada.</w:t>
+            </w:r>
+          </w:p>
+        </w:tc>
+        <w:tc>
+          <w:tcPr>
+            <w:tcW w:w="2077" w:type="dxa"/>
+          </w:tcPr>
+          <w:p>
+            <w:pPr>
+              <w:jc w:val="center"/>
+              <w:rPr>
+                <w:rFonts w:ascii="Arial" w:hAnsi="Arial" w:cs="Arial"/>
+                <w:lang w:val="es-ES"/>
+              </w:rPr>
+            </w:pPr>
+          </w:p>
+        </w:tc>
+      </w:tr>
+      <w:tr>
+        <w:tc>
+          <w:tcPr>
+            <w:tcW w:w="1617" w:type="dxa"/>
+          </w:tcPr>
+          <w:p>
+            <w:pPr>
+              <w:jc w:val="center"/>
+              <w:rPr>
+                <w:rFonts w:ascii="Arial" w:hAnsi="Arial" w:cs="Arial"/>
+              </w:rPr>
+            </w:pPr>
+            <w:r>
+              <w:rPr>
+                <w:rFonts w:ascii="Arial" w:hAnsi="Arial" w:cs="Arial"/>
+              </w:rPr>
+              <w:t>CP-30</w:t>
+            </w:r>
+          </w:p>
+        </w:tc>
+        <w:tc>
+          <w:tcPr>
+            <w:tcW w:w="2074" w:type="dxa"/>
+          </w:tcPr>
+          <w:p>
+            <w:pPr>
+              <w:jc w:val="center"/>
+              <w:rPr>
+                <w:rFonts w:ascii="Arial" w:hAnsi="Arial" w:cs="Arial"/>
+                <w:lang w:val="es-ES"/>
+              </w:rPr>
+            </w:pPr>
+            <w:r>
+              <w:rPr>
+                <w:rFonts w:ascii="Arial" w:hAnsi="Arial" w:cs="Arial"/>
+                <w:lang w:val="es-ES"/>
+              </w:rPr>
+              <w:t>RF-14</w:t>
+            </w:r>
+          </w:p>
+        </w:tc>
+        <w:tc>
+          <w:tcPr>
+            <w:tcW w:w="1651" w:type="dxa"/>
+          </w:tcPr>
+          <w:p>
+            <w:pPr>
+              <w:jc w:val="center"/>
+              <w:rPr>
+                <w:rFonts w:ascii="Arial" w:hAnsi="Arial" w:cs="Arial"/>
+                <w:lang w:val="es-ES"/>
+              </w:rPr>
+            </w:pPr>
+            <w:r>
+              <w:rPr>
+                <w:rFonts w:ascii="Arial" w:hAnsi="Arial" w:cs="Arial"/>
+                <w:lang w:val="es-ES"/>
+              </w:rPr>
+              <w:t>Sesión activa con al menos un movimiento de cada tipo.</w:t>
+            </w:r>
+          </w:p>
+        </w:tc>
+        <w:tc>
+          <w:tcPr>
+            <w:tcW w:w="2924" w:type="dxa"/>
+          </w:tcPr>
+          <w:p>
+            <w:pPr>
+              <w:jc w:val="center"/>
+              <w:rPr>
+                <w:rFonts w:ascii="Arial" w:hAnsi="Arial" w:cs="Arial"/>
+                <w:lang w:val="es-ES"/>
+              </w:rPr>
+            </w:pPr>
+            <w:r>
+              <w:rPr>
+                <w:rFonts w:ascii="Arial" w:hAnsi="Arial" w:cs="Arial"/>
+                <w:lang w:val="es-ES"/>
+              </w:rPr>
+              <w:t>El dashboard muestra el resumen completo de movimientos.</w:t>
+            </w:r>
+          </w:p>
+        </w:tc>
+        <w:tc>
+          <w:tcPr>
+            <w:tcW w:w="2077" w:type="dxa"/>
+          </w:tcPr>
+          <w:p>
+            <w:pPr>
+              <w:jc w:val="center"/>
+              <w:rPr>
+                <w:rFonts w:ascii="Arial" w:hAnsi="Arial" w:cs="Arial"/>
+                <w:lang w:val="es-ES"/>
+              </w:rPr>
+            </w:pPr>
+          </w:p>
+        </w:tc>
+      </w:tr>
+      <w:tr>
+        <w:tc>
+          <w:tcPr>
+            <w:tcW w:w="1617" w:type="dxa"/>
+          </w:tcPr>
+          <w:p>
+            <w:pPr>
+              <w:jc w:val="center"/>
+              <w:rPr>
+                <w:rFonts w:ascii="Arial" w:hAnsi="Arial" w:cs="Arial"/>
+                <w:lang w:val="es-ES"/>
+              </w:rPr>
+            </w:pPr>
+          </w:p>
+          <w:p>
+            <w:pPr>
+              <w:jc w:val="center"/>
+              <w:rPr>
+                <w:rFonts w:ascii="Arial" w:hAnsi="Arial" w:cs="Arial"/>
+                <w:lang w:val="es-ES"/>
+              </w:rPr>
+            </w:pPr>
             <w:bookmarkStart w:id="0" w:name="_GoBack"/>
             <w:bookmarkEnd w:id="0"/>
-          </w:p>
-        </w:tc>
-        <w:tc>
-          <w:tcPr>
-            <w:tcW w:w="2077" w:type="dxa"/>
-          </w:tcPr>
-          <w:p>
-            <w:pPr>
-              <w:jc w:val="center"/>
-              <w:rPr>
-                <w:rFonts w:ascii="Arial" w:hAnsi="Arial" w:cs="Arial"/>
-                <w:lang w:val="es-ES"/>
-              </w:rPr>
-            </w:pPr>
-          </w:p>
-        </w:tc>
-      </w:tr>
-      <w:tr>
-        <w:tc>
-          <w:tcPr>
-            <w:tcW w:w="1617" w:type="dxa"/>
-          </w:tcPr>
-          <w:p>
-            <w:pPr>
-              <w:jc w:val="center"/>
-              <w:rPr>
-                <w:rFonts w:ascii="Arial" w:hAnsi="Arial" w:cs="Arial"/>
-                <w:lang w:val="es-ES"/>
-              </w:rPr>
-            </w:pPr>
+            <w:r>
+              <w:rPr>
+                <w:rFonts w:ascii="Arial" w:hAnsi="Arial" w:cs="Arial"/>
+                <w:lang w:val="es-ES"/>
+              </w:rPr>
+              <w:t>CP-31</w:t>
+            </w:r>
           </w:p>
         </w:tc>
         <w:tc>
@@ -2014,6 +3986,22 @@
               </w:rPr>
             </w:pPr>
           </w:p>
+          <w:p>
+            <w:pPr>
+              <w:jc w:val="center"/>
+              <w:rPr>
+                <w:rFonts w:ascii="Arial" w:hAnsi="Arial" w:cs="Arial"/>
+                <w:lang w:val="es-ES"/>
+              </w:rPr>
+            </w:pPr>
+            <w:r>
+              <w:rPr>
+                <w:rFonts w:ascii="Arial" w:hAnsi="Arial" w:cs="Arial"/>
+                <w:lang w:val="es-ES"/>
+              </w:rPr>
+              <w:t>RF-14</w:t>
+            </w:r>
+          </w:p>
         </w:tc>
         <w:tc>
           <w:tcPr>
@@ -2027,6 +4015,13 @@
                 <w:lang w:val="es-ES"/>
               </w:rPr>
             </w:pPr>
+            <w:r>
+              <w:rPr>
+                <w:rFonts w:ascii="Arial" w:hAnsi="Arial" w:cs="Arial"/>
+                <w:lang w:val="es-ES"/>
+              </w:rPr>
+              <w:t>Sesión activa sin movimientos registrados.</w:t>
+            </w:r>
           </w:p>
         </w:tc>
         <w:tc>
@@ -2041,1086 +4036,13 @@
                 <w:lang w:val="es-ES"/>
               </w:rPr>
             </w:pPr>
-          </w:p>
-        </w:tc>
-        <w:tc>
-          <w:tcPr>
-            <w:tcW w:w="2077" w:type="dxa"/>
-          </w:tcPr>
-          <w:p>
-            <w:pPr>
-              <w:jc w:val="center"/>
-              <w:rPr>
-                <w:rFonts w:ascii="Arial" w:hAnsi="Arial" w:cs="Arial"/>
-                <w:lang w:val="es-ES"/>
-              </w:rPr>
-            </w:pPr>
-          </w:p>
-        </w:tc>
-      </w:tr>
-      <w:tr>
-        <w:tc>
-          <w:tcPr>
-            <w:tcW w:w="1617" w:type="dxa"/>
-          </w:tcPr>
-          <w:p>
-            <w:pPr>
-              <w:jc w:val="center"/>
-              <w:rPr>
-                <w:rFonts w:ascii="Arial" w:hAnsi="Arial" w:cs="Arial"/>
-                <w:lang w:val="es-ES"/>
-              </w:rPr>
-            </w:pPr>
-          </w:p>
-        </w:tc>
-        <w:tc>
-          <w:tcPr>
-            <w:tcW w:w="2074" w:type="dxa"/>
-          </w:tcPr>
-          <w:p>
-            <w:pPr>
-              <w:jc w:val="center"/>
-              <w:rPr>
-                <w:rFonts w:ascii="Arial" w:hAnsi="Arial" w:cs="Arial"/>
-                <w:lang w:val="es-ES"/>
-              </w:rPr>
-            </w:pPr>
-          </w:p>
-        </w:tc>
-        <w:tc>
-          <w:tcPr>
-            <w:tcW w:w="1651" w:type="dxa"/>
-          </w:tcPr>
-          <w:p>
-            <w:pPr>
-              <w:jc w:val="center"/>
-              <w:rPr>
-                <w:rFonts w:ascii="Arial" w:hAnsi="Arial" w:cs="Arial"/>
-                <w:lang w:val="es-ES"/>
-              </w:rPr>
-            </w:pPr>
-          </w:p>
-        </w:tc>
-        <w:tc>
-          <w:tcPr>
-            <w:tcW w:w="2924" w:type="dxa"/>
-          </w:tcPr>
-          <w:p>
-            <w:pPr>
-              <w:jc w:val="center"/>
-              <w:rPr>
-                <w:rFonts w:ascii="Arial" w:hAnsi="Arial" w:cs="Arial"/>
-                <w:lang w:val="es-ES"/>
-              </w:rPr>
-            </w:pPr>
-          </w:p>
-        </w:tc>
-        <w:tc>
-          <w:tcPr>
-            <w:tcW w:w="2077" w:type="dxa"/>
-          </w:tcPr>
-          <w:p>
-            <w:pPr>
-              <w:jc w:val="center"/>
-              <w:rPr>
-                <w:rFonts w:ascii="Arial" w:hAnsi="Arial" w:cs="Arial"/>
-                <w:lang w:val="es-ES"/>
-              </w:rPr>
-            </w:pPr>
-          </w:p>
-        </w:tc>
-      </w:tr>
-      <w:tr>
-        <w:tc>
-          <w:tcPr>
-            <w:tcW w:w="1617" w:type="dxa"/>
-          </w:tcPr>
-          <w:p>
-            <w:pPr>
-              <w:jc w:val="center"/>
-              <w:rPr>
-                <w:rFonts w:ascii="Arial" w:hAnsi="Arial" w:cs="Arial"/>
-                <w:lang w:val="es-ES"/>
-              </w:rPr>
-            </w:pPr>
-          </w:p>
-        </w:tc>
-        <w:tc>
-          <w:tcPr>
-            <w:tcW w:w="2074" w:type="dxa"/>
-          </w:tcPr>
-          <w:p>
-            <w:pPr>
-              <w:jc w:val="center"/>
-              <w:rPr>
-                <w:rFonts w:ascii="Arial" w:hAnsi="Arial" w:cs="Arial"/>
-                <w:lang w:val="es-ES"/>
-              </w:rPr>
-            </w:pPr>
-          </w:p>
-        </w:tc>
-        <w:tc>
-          <w:tcPr>
-            <w:tcW w:w="1651" w:type="dxa"/>
-          </w:tcPr>
-          <w:p>
-            <w:pPr>
-              <w:jc w:val="center"/>
-              <w:rPr>
-                <w:rFonts w:ascii="Arial" w:hAnsi="Arial" w:cs="Arial"/>
-                <w:lang w:val="es-ES"/>
-              </w:rPr>
-            </w:pPr>
-          </w:p>
-        </w:tc>
-        <w:tc>
-          <w:tcPr>
-            <w:tcW w:w="2924" w:type="dxa"/>
-          </w:tcPr>
-          <w:p>
-            <w:pPr>
-              <w:jc w:val="center"/>
-              <w:rPr>
-                <w:rFonts w:ascii="Arial" w:hAnsi="Arial" w:cs="Arial"/>
-                <w:lang w:val="es-ES"/>
-              </w:rPr>
-            </w:pPr>
-          </w:p>
-        </w:tc>
-        <w:tc>
-          <w:tcPr>
-            <w:tcW w:w="2077" w:type="dxa"/>
-          </w:tcPr>
-          <w:p>
-            <w:pPr>
-              <w:jc w:val="center"/>
-              <w:rPr>
-                <w:rFonts w:ascii="Arial" w:hAnsi="Arial" w:cs="Arial"/>
-                <w:lang w:val="es-ES"/>
-              </w:rPr>
-            </w:pPr>
-          </w:p>
-        </w:tc>
-      </w:tr>
-      <w:tr>
-        <w:tc>
-          <w:tcPr>
-            <w:tcW w:w="1617" w:type="dxa"/>
-          </w:tcPr>
-          <w:p>
-            <w:pPr>
-              <w:jc w:val="center"/>
-              <w:rPr>
-                <w:rFonts w:ascii="Arial" w:hAnsi="Arial" w:cs="Arial"/>
-                <w:lang w:val="es-ES"/>
-              </w:rPr>
-            </w:pPr>
-          </w:p>
-        </w:tc>
-        <w:tc>
-          <w:tcPr>
-            <w:tcW w:w="2074" w:type="dxa"/>
-          </w:tcPr>
-          <w:p>
-            <w:pPr>
-              <w:jc w:val="center"/>
-              <w:rPr>
-                <w:rFonts w:ascii="Arial" w:hAnsi="Arial" w:cs="Arial"/>
-                <w:lang w:val="es-ES"/>
-              </w:rPr>
-            </w:pPr>
-          </w:p>
-        </w:tc>
-        <w:tc>
-          <w:tcPr>
-            <w:tcW w:w="1651" w:type="dxa"/>
-          </w:tcPr>
-          <w:p>
-            <w:pPr>
-              <w:jc w:val="center"/>
-              <w:rPr>
-                <w:rFonts w:ascii="Arial" w:hAnsi="Arial" w:cs="Arial"/>
-                <w:lang w:val="es-ES"/>
-              </w:rPr>
-            </w:pPr>
-          </w:p>
-        </w:tc>
-        <w:tc>
-          <w:tcPr>
-            <w:tcW w:w="2924" w:type="dxa"/>
-          </w:tcPr>
-          <w:p>
-            <w:pPr>
-              <w:jc w:val="center"/>
-              <w:rPr>
-                <w:rFonts w:ascii="Arial" w:hAnsi="Arial" w:cs="Arial"/>
-                <w:lang w:val="es-ES"/>
-              </w:rPr>
-            </w:pPr>
-          </w:p>
-        </w:tc>
-        <w:tc>
-          <w:tcPr>
-            <w:tcW w:w="2077" w:type="dxa"/>
-          </w:tcPr>
-          <w:p>
-            <w:pPr>
-              <w:jc w:val="center"/>
-              <w:rPr>
-                <w:rFonts w:ascii="Arial" w:hAnsi="Arial" w:cs="Arial"/>
-                <w:lang w:val="es-ES"/>
-              </w:rPr>
-            </w:pPr>
-          </w:p>
-        </w:tc>
-      </w:tr>
-      <w:tr>
-        <w:tc>
-          <w:tcPr>
-            <w:tcW w:w="1617" w:type="dxa"/>
-          </w:tcPr>
-          <w:p>
-            <w:pPr>
-              <w:jc w:val="center"/>
-              <w:rPr>
-                <w:rFonts w:ascii="Arial" w:hAnsi="Arial" w:cs="Arial"/>
-                <w:lang w:val="es-ES"/>
-              </w:rPr>
-            </w:pPr>
-          </w:p>
-        </w:tc>
-        <w:tc>
-          <w:tcPr>
-            <w:tcW w:w="2074" w:type="dxa"/>
-          </w:tcPr>
-          <w:p>
-            <w:pPr>
-              <w:jc w:val="center"/>
-              <w:rPr>
-                <w:rFonts w:ascii="Arial" w:hAnsi="Arial" w:cs="Arial"/>
-                <w:lang w:val="es-ES"/>
-              </w:rPr>
-            </w:pPr>
-          </w:p>
-        </w:tc>
-        <w:tc>
-          <w:tcPr>
-            <w:tcW w:w="1651" w:type="dxa"/>
-          </w:tcPr>
-          <w:p>
-            <w:pPr>
-              <w:jc w:val="center"/>
-              <w:rPr>
-                <w:rFonts w:ascii="Arial" w:hAnsi="Arial" w:cs="Arial"/>
-                <w:lang w:val="es-ES"/>
-              </w:rPr>
-            </w:pPr>
-          </w:p>
-        </w:tc>
-        <w:tc>
-          <w:tcPr>
-            <w:tcW w:w="2924" w:type="dxa"/>
-          </w:tcPr>
-          <w:p>
-            <w:pPr>
-              <w:jc w:val="center"/>
-              <w:rPr>
-                <w:rFonts w:ascii="Arial" w:hAnsi="Arial" w:cs="Arial"/>
-                <w:lang w:val="es-ES"/>
-              </w:rPr>
-            </w:pPr>
-          </w:p>
-        </w:tc>
-        <w:tc>
-          <w:tcPr>
-            <w:tcW w:w="2077" w:type="dxa"/>
-          </w:tcPr>
-          <w:p>
-            <w:pPr>
-              <w:jc w:val="center"/>
-              <w:rPr>
-                <w:rFonts w:ascii="Arial" w:hAnsi="Arial" w:cs="Arial"/>
-                <w:lang w:val="es-ES"/>
-              </w:rPr>
-            </w:pPr>
-          </w:p>
-        </w:tc>
-      </w:tr>
-      <w:tr>
-        <w:tc>
-          <w:tcPr>
-            <w:tcW w:w="1617" w:type="dxa"/>
-          </w:tcPr>
-          <w:p>
-            <w:pPr>
-              <w:jc w:val="center"/>
-              <w:rPr>
-                <w:rFonts w:ascii="Arial" w:hAnsi="Arial" w:cs="Arial"/>
-                <w:lang w:val="es-ES"/>
-              </w:rPr>
-            </w:pPr>
-          </w:p>
-        </w:tc>
-        <w:tc>
-          <w:tcPr>
-            <w:tcW w:w="2074" w:type="dxa"/>
-          </w:tcPr>
-          <w:p>
-            <w:pPr>
-              <w:jc w:val="center"/>
-              <w:rPr>
-                <w:rFonts w:ascii="Arial" w:hAnsi="Arial" w:cs="Arial"/>
-                <w:lang w:val="es-ES"/>
-              </w:rPr>
-            </w:pPr>
-          </w:p>
-        </w:tc>
-        <w:tc>
-          <w:tcPr>
-            <w:tcW w:w="1651" w:type="dxa"/>
-          </w:tcPr>
-          <w:p>
-            <w:pPr>
-              <w:jc w:val="center"/>
-              <w:rPr>
-                <w:rFonts w:ascii="Arial" w:hAnsi="Arial" w:cs="Arial"/>
-                <w:lang w:val="es-ES"/>
-              </w:rPr>
-            </w:pPr>
-          </w:p>
-        </w:tc>
-        <w:tc>
-          <w:tcPr>
-            <w:tcW w:w="2924" w:type="dxa"/>
-          </w:tcPr>
-          <w:p>
-            <w:pPr>
-              <w:jc w:val="center"/>
-              <w:rPr>
-                <w:rFonts w:ascii="Arial" w:hAnsi="Arial" w:cs="Arial"/>
-                <w:lang w:val="es-ES"/>
-              </w:rPr>
-            </w:pPr>
-          </w:p>
-        </w:tc>
-        <w:tc>
-          <w:tcPr>
-            <w:tcW w:w="2077" w:type="dxa"/>
-          </w:tcPr>
-          <w:p>
-            <w:pPr>
-              <w:jc w:val="center"/>
-              <w:rPr>
-                <w:rFonts w:ascii="Arial" w:hAnsi="Arial" w:cs="Arial"/>
-                <w:lang w:val="es-ES"/>
-              </w:rPr>
-            </w:pPr>
-          </w:p>
-        </w:tc>
-      </w:tr>
-      <w:tr>
-        <w:tc>
-          <w:tcPr>
-            <w:tcW w:w="1617" w:type="dxa"/>
-          </w:tcPr>
-          <w:p>
-            <w:pPr>
-              <w:jc w:val="center"/>
-              <w:rPr>
-                <w:rFonts w:ascii="Arial" w:hAnsi="Arial" w:cs="Arial"/>
-                <w:lang w:val="es-ES"/>
-              </w:rPr>
-            </w:pPr>
-          </w:p>
-        </w:tc>
-        <w:tc>
-          <w:tcPr>
-            <w:tcW w:w="2074" w:type="dxa"/>
-          </w:tcPr>
-          <w:p>
-            <w:pPr>
-              <w:jc w:val="center"/>
-              <w:rPr>
-                <w:rFonts w:ascii="Arial" w:hAnsi="Arial" w:cs="Arial"/>
-                <w:lang w:val="es-ES"/>
-              </w:rPr>
-            </w:pPr>
-          </w:p>
-        </w:tc>
-        <w:tc>
-          <w:tcPr>
-            <w:tcW w:w="1651" w:type="dxa"/>
-          </w:tcPr>
-          <w:p>
-            <w:pPr>
-              <w:jc w:val="center"/>
-              <w:rPr>
-                <w:rFonts w:ascii="Arial" w:hAnsi="Arial" w:cs="Arial"/>
-                <w:lang w:val="es-ES"/>
-              </w:rPr>
-            </w:pPr>
-          </w:p>
-        </w:tc>
-        <w:tc>
-          <w:tcPr>
-            <w:tcW w:w="2924" w:type="dxa"/>
-          </w:tcPr>
-          <w:p>
-            <w:pPr>
-              <w:jc w:val="center"/>
-              <w:rPr>
-                <w:rFonts w:ascii="Arial" w:hAnsi="Arial" w:cs="Arial"/>
-                <w:lang w:val="es-ES"/>
-              </w:rPr>
-            </w:pPr>
-          </w:p>
-        </w:tc>
-        <w:tc>
-          <w:tcPr>
-            <w:tcW w:w="2077" w:type="dxa"/>
-          </w:tcPr>
-          <w:p>
-            <w:pPr>
-              <w:jc w:val="center"/>
-              <w:rPr>
-                <w:rFonts w:ascii="Arial" w:hAnsi="Arial" w:cs="Arial"/>
-                <w:lang w:val="es-ES"/>
-              </w:rPr>
-            </w:pPr>
-          </w:p>
-        </w:tc>
-      </w:tr>
-      <w:tr>
-        <w:tc>
-          <w:tcPr>
-            <w:tcW w:w="1617" w:type="dxa"/>
-          </w:tcPr>
-          <w:p>
-            <w:pPr>
-              <w:jc w:val="center"/>
-              <w:rPr>
-                <w:rFonts w:ascii="Arial" w:hAnsi="Arial" w:cs="Arial"/>
-                <w:lang w:val="es-ES"/>
-              </w:rPr>
-            </w:pPr>
-          </w:p>
-        </w:tc>
-        <w:tc>
-          <w:tcPr>
-            <w:tcW w:w="2074" w:type="dxa"/>
-          </w:tcPr>
-          <w:p>
-            <w:pPr>
-              <w:jc w:val="center"/>
-              <w:rPr>
-                <w:rFonts w:ascii="Arial" w:hAnsi="Arial" w:cs="Arial"/>
-                <w:lang w:val="es-ES"/>
-              </w:rPr>
-            </w:pPr>
-          </w:p>
-        </w:tc>
-        <w:tc>
-          <w:tcPr>
-            <w:tcW w:w="1651" w:type="dxa"/>
-          </w:tcPr>
-          <w:p>
-            <w:pPr>
-              <w:jc w:val="center"/>
-              <w:rPr>
-                <w:rFonts w:ascii="Arial" w:hAnsi="Arial" w:cs="Arial"/>
-                <w:lang w:val="es-ES"/>
-              </w:rPr>
-            </w:pPr>
-          </w:p>
-        </w:tc>
-        <w:tc>
-          <w:tcPr>
-            <w:tcW w:w="2924" w:type="dxa"/>
-          </w:tcPr>
-          <w:p>
-            <w:pPr>
-              <w:jc w:val="center"/>
-              <w:rPr>
-                <w:rFonts w:ascii="Arial" w:hAnsi="Arial" w:cs="Arial"/>
-                <w:lang w:val="es-ES"/>
-              </w:rPr>
-            </w:pPr>
-          </w:p>
-        </w:tc>
-        <w:tc>
-          <w:tcPr>
-            <w:tcW w:w="2077" w:type="dxa"/>
-          </w:tcPr>
-          <w:p>
-            <w:pPr>
-              <w:jc w:val="center"/>
-              <w:rPr>
-                <w:rFonts w:ascii="Arial" w:hAnsi="Arial" w:cs="Arial"/>
-                <w:lang w:val="es-ES"/>
-              </w:rPr>
-            </w:pPr>
-          </w:p>
-        </w:tc>
-      </w:tr>
-      <w:tr>
-        <w:tc>
-          <w:tcPr>
-            <w:tcW w:w="1617" w:type="dxa"/>
-          </w:tcPr>
-          <w:p>
-            <w:pPr>
-              <w:jc w:val="center"/>
-              <w:rPr>
-                <w:rFonts w:ascii="Arial" w:hAnsi="Arial" w:cs="Arial"/>
-                <w:lang w:val="es-ES"/>
-              </w:rPr>
-            </w:pPr>
-          </w:p>
-        </w:tc>
-        <w:tc>
-          <w:tcPr>
-            <w:tcW w:w="2074" w:type="dxa"/>
-          </w:tcPr>
-          <w:p>
-            <w:pPr>
-              <w:jc w:val="center"/>
-              <w:rPr>
-                <w:rFonts w:ascii="Arial" w:hAnsi="Arial" w:cs="Arial"/>
-                <w:lang w:val="es-ES"/>
-              </w:rPr>
-            </w:pPr>
-          </w:p>
-        </w:tc>
-        <w:tc>
-          <w:tcPr>
-            <w:tcW w:w="1651" w:type="dxa"/>
-          </w:tcPr>
-          <w:p>
-            <w:pPr>
-              <w:jc w:val="center"/>
-              <w:rPr>
-                <w:rFonts w:ascii="Arial" w:hAnsi="Arial" w:cs="Arial"/>
-                <w:lang w:val="es-ES"/>
-              </w:rPr>
-            </w:pPr>
-          </w:p>
-        </w:tc>
-        <w:tc>
-          <w:tcPr>
-            <w:tcW w:w="2924" w:type="dxa"/>
-          </w:tcPr>
-          <w:p>
-            <w:pPr>
-              <w:jc w:val="center"/>
-              <w:rPr>
-                <w:rFonts w:ascii="Arial" w:hAnsi="Arial" w:cs="Arial"/>
-                <w:lang w:val="es-ES"/>
-              </w:rPr>
-            </w:pPr>
-          </w:p>
-        </w:tc>
-        <w:tc>
-          <w:tcPr>
-            <w:tcW w:w="2077" w:type="dxa"/>
-          </w:tcPr>
-          <w:p>
-            <w:pPr>
-              <w:jc w:val="center"/>
-              <w:rPr>
-                <w:rFonts w:ascii="Arial" w:hAnsi="Arial" w:cs="Arial"/>
-                <w:lang w:val="es-ES"/>
-              </w:rPr>
-            </w:pPr>
-          </w:p>
-        </w:tc>
-      </w:tr>
-      <w:tr>
-        <w:tc>
-          <w:tcPr>
-            <w:tcW w:w="1617" w:type="dxa"/>
-          </w:tcPr>
-          <w:p>
-            <w:pPr>
-              <w:jc w:val="center"/>
-              <w:rPr>
-                <w:rFonts w:ascii="Arial" w:hAnsi="Arial" w:cs="Arial"/>
-                <w:lang w:val="es-ES"/>
-              </w:rPr>
-            </w:pPr>
-          </w:p>
-        </w:tc>
-        <w:tc>
-          <w:tcPr>
-            <w:tcW w:w="2074" w:type="dxa"/>
-          </w:tcPr>
-          <w:p>
-            <w:pPr>
-              <w:jc w:val="center"/>
-              <w:rPr>
-                <w:rFonts w:ascii="Arial" w:hAnsi="Arial" w:cs="Arial"/>
-                <w:lang w:val="es-ES"/>
-              </w:rPr>
-            </w:pPr>
-          </w:p>
-        </w:tc>
-        <w:tc>
-          <w:tcPr>
-            <w:tcW w:w="1651" w:type="dxa"/>
-          </w:tcPr>
-          <w:p>
-            <w:pPr>
-              <w:jc w:val="center"/>
-              <w:rPr>
-                <w:rFonts w:ascii="Arial" w:hAnsi="Arial" w:cs="Arial"/>
-                <w:lang w:val="es-ES"/>
-              </w:rPr>
-            </w:pPr>
-          </w:p>
-        </w:tc>
-        <w:tc>
-          <w:tcPr>
-            <w:tcW w:w="2924" w:type="dxa"/>
-          </w:tcPr>
-          <w:p>
-            <w:pPr>
-              <w:jc w:val="center"/>
-              <w:rPr>
-                <w:rFonts w:ascii="Arial" w:hAnsi="Arial" w:cs="Arial"/>
-                <w:lang w:val="es-ES"/>
-              </w:rPr>
-            </w:pPr>
-          </w:p>
-        </w:tc>
-        <w:tc>
-          <w:tcPr>
-            <w:tcW w:w="2077" w:type="dxa"/>
-          </w:tcPr>
-          <w:p>
-            <w:pPr>
-              <w:jc w:val="center"/>
-              <w:rPr>
-                <w:rFonts w:ascii="Arial" w:hAnsi="Arial" w:cs="Arial"/>
-                <w:lang w:val="es-ES"/>
-              </w:rPr>
-            </w:pPr>
-          </w:p>
-        </w:tc>
-      </w:tr>
-      <w:tr>
-        <w:tc>
-          <w:tcPr>
-            <w:tcW w:w="1617" w:type="dxa"/>
-          </w:tcPr>
-          <w:p>
-            <w:pPr>
-              <w:jc w:val="center"/>
-              <w:rPr>
-                <w:rFonts w:ascii="Arial" w:hAnsi="Arial" w:cs="Arial"/>
-                <w:lang w:val="es-ES"/>
-              </w:rPr>
-            </w:pPr>
-          </w:p>
-        </w:tc>
-        <w:tc>
-          <w:tcPr>
-            <w:tcW w:w="2074" w:type="dxa"/>
-          </w:tcPr>
-          <w:p>
-            <w:pPr>
-              <w:jc w:val="center"/>
-              <w:rPr>
-                <w:rFonts w:ascii="Arial" w:hAnsi="Arial" w:cs="Arial"/>
-                <w:lang w:val="es-ES"/>
-              </w:rPr>
-            </w:pPr>
-          </w:p>
-        </w:tc>
-        <w:tc>
-          <w:tcPr>
-            <w:tcW w:w="1651" w:type="dxa"/>
-          </w:tcPr>
-          <w:p>
-            <w:pPr>
-              <w:jc w:val="center"/>
-              <w:rPr>
-                <w:rFonts w:ascii="Arial" w:hAnsi="Arial" w:cs="Arial"/>
-                <w:lang w:val="es-ES"/>
-              </w:rPr>
-            </w:pPr>
-          </w:p>
-        </w:tc>
-        <w:tc>
-          <w:tcPr>
-            <w:tcW w:w="2924" w:type="dxa"/>
-          </w:tcPr>
-          <w:p>
-            <w:pPr>
-              <w:jc w:val="center"/>
-              <w:rPr>
-                <w:rFonts w:ascii="Arial" w:hAnsi="Arial" w:cs="Arial"/>
-                <w:lang w:val="es-ES"/>
-              </w:rPr>
-            </w:pPr>
-          </w:p>
-        </w:tc>
-        <w:tc>
-          <w:tcPr>
-            <w:tcW w:w="2077" w:type="dxa"/>
-          </w:tcPr>
-          <w:p>
-            <w:pPr>
-              <w:jc w:val="center"/>
-              <w:rPr>
-                <w:rFonts w:ascii="Arial" w:hAnsi="Arial" w:cs="Arial"/>
-                <w:lang w:val="es-ES"/>
-              </w:rPr>
-            </w:pPr>
-          </w:p>
-        </w:tc>
-      </w:tr>
-      <w:tr>
-        <w:tc>
-          <w:tcPr>
-            <w:tcW w:w="1617" w:type="dxa"/>
-          </w:tcPr>
-          <w:p>
-            <w:pPr>
-              <w:jc w:val="center"/>
-              <w:rPr>
-                <w:rFonts w:ascii="Arial" w:hAnsi="Arial" w:cs="Arial"/>
-                <w:lang w:val="es-ES"/>
-              </w:rPr>
-            </w:pPr>
-          </w:p>
-        </w:tc>
-        <w:tc>
-          <w:tcPr>
-            <w:tcW w:w="2074" w:type="dxa"/>
-          </w:tcPr>
-          <w:p>
-            <w:pPr>
-              <w:jc w:val="center"/>
-              <w:rPr>
-                <w:rFonts w:ascii="Arial" w:hAnsi="Arial" w:cs="Arial"/>
-                <w:lang w:val="es-ES"/>
-              </w:rPr>
-            </w:pPr>
-          </w:p>
-        </w:tc>
-        <w:tc>
-          <w:tcPr>
-            <w:tcW w:w="1651" w:type="dxa"/>
-          </w:tcPr>
-          <w:p>
-            <w:pPr>
-              <w:jc w:val="center"/>
-              <w:rPr>
-                <w:rFonts w:ascii="Arial" w:hAnsi="Arial" w:cs="Arial"/>
-                <w:lang w:val="es-ES"/>
-              </w:rPr>
-            </w:pPr>
-          </w:p>
-        </w:tc>
-        <w:tc>
-          <w:tcPr>
-            <w:tcW w:w="2924" w:type="dxa"/>
-          </w:tcPr>
-          <w:p>
-            <w:pPr>
-              <w:jc w:val="center"/>
-              <w:rPr>
-                <w:rFonts w:ascii="Arial" w:hAnsi="Arial" w:cs="Arial"/>
-                <w:lang w:val="es-ES"/>
-              </w:rPr>
-            </w:pPr>
-          </w:p>
-        </w:tc>
-        <w:tc>
-          <w:tcPr>
-            <w:tcW w:w="2077" w:type="dxa"/>
-          </w:tcPr>
-          <w:p>
-            <w:pPr>
-              <w:jc w:val="center"/>
-              <w:rPr>
-                <w:rFonts w:ascii="Arial" w:hAnsi="Arial" w:cs="Arial"/>
-                <w:lang w:val="es-ES"/>
-              </w:rPr>
-            </w:pPr>
-          </w:p>
-        </w:tc>
-      </w:tr>
-      <w:tr>
-        <w:tc>
-          <w:tcPr>
-            <w:tcW w:w="1617" w:type="dxa"/>
-          </w:tcPr>
-          <w:p>
-            <w:pPr>
-              <w:jc w:val="center"/>
-              <w:rPr>
-                <w:rFonts w:ascii="Arial" w:hAnsi="Arial" w:cs="Arial"/>
-                <w:lang w:val="es-ES"/>
-              </w:rPr>
-            </w:pPr>
-          </w:p>
-        </w:tc>
-        <w:tc>
-          <w:tcPr>
-            <w:tcW w:w="2074" w:type="dxa"/>
-          </w:tcPr>
-          <w:p>
-            <w:pPr>
-              <w:jc w:val="center"/>
-              <w:rPr>
-                <w:rFonts w:ascii="Arial" w:hAnsi="Arial" w:cs="Arial"/>
-                <w:lang w:val="es-ES"/>
-              </w:rPr>
-            </w:pPr>
-          </w:p>
-        </w:tc>
-        <w:tc>
-          <w:tcPr>
-            <w:tcW w:w="1651" w:type="dxa"/>
-          </w:tcPr>
-          <w:p>
-            <w:pPr>
-              <w:jc w:val="center"/>
-              <w:rPr>
-                <w:rFonts w:ascii="Arial" w:hAnsi="Arial" w:cs="Arial"/>
-                <w:lang w:val="es-ES"/>
-              </w:rPr>
-            </w:pPr>
-          </w:p>
-        </w:tc>
-        <w:tc>
-          <w:tcPr>
-            <w:tcW w:w="2924" w:type="dxa"/>
-          </w:tcPr>
-          <w:p>
-            <w:pPr>
-              <w:jc w:val="center"/>
-              <w:rPr>
-                <w:rFonts w:ascii="Arial" w:hAnsi="Arial" w:cs="Arial"/>
-                <w:lang w:val="es-ES"/>
-              </w:rPr>
-            </w:pPr>
-          </w:p>
-        </w:tc>
-        <w:tc>
-          <w:tcPr>
-            <w:tcW w:w="2077" w:type="dxa"/>
-          </w:tcPr>
-          <w:p>
-            <w:pPr>
-              <w:jc w:val="center"/>
-              <w:rPr>
-                <w:rFonts w:ascii="Arial" w:hAnsi="Arial" w:cs="Arial"/>
-                <w:lang w:val="es-ES"/>
-              </w:rPr>
-            </w:pPr>
-          </w:p>
-        </w:tc>
-      </w:tr>
-      <w:tr>
-        <w:tc>
-          <w:tcPr>
-            <w:tcW w:w="1617" w:type="dxa"/>
-          </w:tcPr>
-          <w:p>
-            <w:pPr>
-              <w:jc w:val="center"/>
-              <w:rPr>
-                <w:rFonts w:ascii="Arial" w:hAnsi="Arial" w:cs="Arial"/>
-                <w:lang w:val="es-ES"/>
-              </w:rPr>
-            </w:pPr>
-          </w:p>
-        </w:tc>
-        <w:tc>
-          <w:tcPr>
-            <w:tcW w:w="2074" w:type="dxa"/>
-          </w:tcPr>
-          <w:p>
-            <w:pPr>
-              <w:jc w:val="center"/>
-              <w:rPr>
-                <w:rFonts w:ascii="Arial" w:hAnsi="Arial" w:cs="Arial"/>
-                <w:lang w:val="es-ES"/>
-              </w:rPr>
-            </w:pPr>
-          </w:p>
-        </w:tc>
-        <w:tc>
-          <w:tcPr>
-            <w:tcW w:w="1651" w:type="dxa"/>
-          </w:tcPr>
-          <w:p>
-            <w:pPr>
-              <w:jc w:val="center"/>
-              <w:rPr>
-                <w:rFonts w:ascii="Arial" w:hAnsi="Arial" w:cs="Arial"/>
-                <w:lang w:val="es-ES"/>
-              </w:rPr>
-            </w:pPr>
-          </w:p>
-        </w:tc>
-        <w:tc>
-          <w:tcPr>
-            <w:tcW w:w="2924" w:type="dxa"/>
-          </w:tcPr>
-          <w:p>
-            <w:pPr>
-              <w:jc w:val="center"/>
-              <w:rPr>
-                <w:rFonts w:ascii="Arial" w:hAnsi="Arial" w:cs="Arial"/>
-                <w:lang w:val="es-ES"/>
-              </w:rPr>
-            </w:pPr>
-          </w:p>
-        </w:tc>
-        <w:tc>
-          <w:tcPr>
-            <w:tcW w:w="2077" w:type="dxa"/>
-          </w:tcPr>
-          <w:p>
-            <w:pPr>
-              <w:jc w:val="center"/>
-              <w:rPr>
-                <w:rFonts w:ascii="Arial" w:hAnsi="Arial" w:cs="Arial"/>
-                <w:lang w:val="es-ES"/>
-              </w:rPr>
-            </w:pPr>
-          </w:p>
-        </w:tc>
-      </w:tr>
-      <w:tr>
-        <w:tc>
-          <w:tcPr>
-            <w:tcW w:w="1617" w:type="dxa"/>
-          </w:tcPr>
-          <w:p>
-            <w:pPr>
-              <w:jc w:val="center"/>
-              <w:rPr>
-                <w:rFonts w:ascii="Arial" w:hAnsi="Arial" w:cs="Arial"/>
-                <w:lang w:val="es-ES"/>
-              </w:rPr>
-            </w:pPr>
-          </w:p>
-        </w:tc>
-        <w:tc>
-          <w:tcPr>
-            <w:tcW w:w="2074" w:type="dxa"/>
-          </w:tcPr>
-          <w:p>
-            <w:pPr>
-              <w:jc w:val="center"/>
-              <w:rPr>
-                <w:rFonts w:ascii="Arial" w:hAnsi="Arial" w:cs="Arial"/>
-                <w:lang w:val="es-ES"/>
-              </w:rPr>
-            </w:pPr>
-          </w:p>
-        </w:tc>
-        <w:tc>
-          <w:tcPr>
-            <w:tcW w:w="1651" w:type="dxa"/>
-          </w:tcPr>
-          <w:p>
-            <w:pPr>
-              <w:jc w:val="center"/>
-              <w:rPr>
-                <w:rFonts w:ascii="Arial" w:hAnsi="Arial" w:cs="Arial"/>
-                <w:lang w:val="es-ES"/>
-              </w:rPr>
-            </w:pPr>
-          </w:p>
-        </w:tc>
-        <w:tc>
-          <w:tcPr>
-            <w:tcW w:w="2924" w:type="dxa"/>
-          </w:tcPr>
-          <w:p>
-            <w:pPr>
-              <w:jc w:val="center"/>
-              <w:rPr>
-                <w:rFonts w:ascii="Arial" w:hAnsi="Arial" w:cs="Arial"/>
-                <w:lang w:val="es-ES"/>
-              </w:rPr>
-            </w:pPr>
-          </w:p>
-        </w:tc>
-        <w:tc>
-          <w:tcPr>
-            <w:tcW w:w="2077" w:type="dxa"/>
-          </w:tcPr>
-          <w:p>
-            <w:pPr>
-              <w:jc w:val="center"/>
-              <w:rPr>
-                <w:rFonts w:ascii="Arial" w:hAnsi="Arial" w:cs="Arial"/>
-                <w:lang w:val="es-ES"/>
-              </w:rPr>
-            </w:pPr>
-          </w:p>
-        </w:tc>
-      </w:tr>
-      <w:tr>
-        <w:tc>
-          <w:tcPr>
-            <w:tcW w:w="1617" w:type="dxa"/>
-          </w:tcPr>
-          <w:p>
-            <w:pPr>
-              <w:jc w:val="center"/>
-              <w:rPr>
-                <w:rFonts w:ascii="Arial" w:hAnsi="Arial" w:cs="Arial"/>
-                <w:lang w:val="es-ES"/>
-              </w:rPr>
-            </w:pPr>
-          </w:p>
-        </w:tc>
-        <w:tc>
-          <w:tcPr>
-            <w:tcW w:w="2074" w:type="dxa"/>
-          </w:tcPr>
-          <w:p>
-            <w:pPr>
-              <w:jc w:val="center"/>
-              <w:rPr>
-                <w:rFonts w:ascii="Arial" w:hAnsi="Arial" w:cs="Arial"/>
-                <w:lang w:val="es-ES"/>
-              </w:rPr>
-            </w:pPr>
-          </w:p>
-        </w:tc>
-        <w:tc>
-          <w:tcPr>
-            <w:tcW w:w="1651" w:type="dxa"/>
-          </w:tcPr>
-          <w:p>
-            <w:pPr>
-              <w:jc w:val="center"/>
-              <w:rPr>
-                <w:rFonts w:ascii="Arial" w:hAnsi="Arial" w:cs="Arial"/>
-                <w:lang w:val="es-ES"/>
-              </w:rPr>
-            </w:pPr>
-          </w:p>
-        </w:tc>
-        <w:tc>
-          <w:tcPr>
-            <w:tcW w:w="2924" w:type="dxa"/>
-          </w:tcPr>
-          <w:p>
-            <w:pPr>
-              <w:jc w:val="center"/>
-              <w:rPr>
-                <w:rFonts w:ascii="Arial" w:hAnsi="Arial" w:cs="Arial"/>
-                <w:lang w:val="es-ES"/>
-              </w:rPr>
-            </w:pPr>
+            <w:r>
+              <w:rPr>
+                <w:rFonts w:ascii="Arial" w:hAnsi="Arial" w:cs="Arial"/>
+                <w:lang w:val="es-ES"/>
+              </w:rPr>
+              <w:t>El dashboard se muestra vacío o nulo en lugar de tener datos.</w:t>
+            </w:r>
           </w:p>
         </w:tc>
         <w:tc>

</xml_diff>